<commit_message>
4312 lab 8 update and fix
</commit_message>
<xml_diff>
--- a/4312/week7/Lab8 Document.docx
+++ b/4312/week7/Lab8 Document.docx
@@ -31,7 +31,7 @@
         <w:spacing w:after="0" w:line="240" w:lineRule="auto"/>
         <w:jc w:val="center"/>
         <w:rPr>
-          <w:rFonts w:ascii="Angsana New" w:hAnsi="Angsana New" w:hint="cs"/>
+          <w:rFonts w:ascii="Angsana New" w:hAnsi="Angsana New"/>
           <w:sz w:val="40"/>
           <w:szCs w:val="40"/>
           <w:cs/>
@@ -306,27 +306,15 @@
         </w:rPr>
         <w:t xml:space="preserve">Predict </w:t>
       </w:r>
-      <w:proofErr w:type="spellStart"/>
-      <w:r>
-        <w:rPr>
-          <w:rFonts w:ascii="Angsana New" w:hAnsi="Angsana New" w:hint="cs"/>
-          <w:sz w:val="32"/>
-          <w:szCs w:val="32"/>
-          <w:cs/>
-          <w:lang w:val="en-US"/>
-        </w:rPr>
-        <w:t>ออกมา</w:t>
-      </w:r>
-      <w:proofErr w:type="spellEnd"/>
-      <w:r>
-        <w:rPr>
-          <w:rFonts w:ascii="Angsana New" w:hAnsi="Angsana New" w:hint="cs"/>
-          <w:sz w:val="32"/>
-          <w:szCs w:val="32"/>
-          <w:cs/>
-          <w:lang w:val="en-US"/>
-        </w:rPr>
-        <w:t xml:space="preserve">นั้น </w:t>
+      <w:r>
+        <w:rPr>
+          <w:rFonts w:ascii="Angsana New" w:hAnsi="Angsana New" w:hint="cs"/>
+          <w:sz w:val="32"/>
+          <w:szCs w:val="32"/>
+          <w:cs/>
+          <w:lang w:val="en-US"/>
+        </w:rPr>
+        <w:t xml:space="preserve">ออกมานั้น </w:t>
       </w:r>
       <w:r>
         <w:rPr>
@@ -425,27 +413,15 @@
         </w:rPr>
         <w:t xml:space="preserve">Validation set </w:t>
       </w:r>
-      <w:proofErr w:type="spellStart"/>
-      <w:r>
-        <w:rPr>
-          <w:rFonts w:ascii="Angsana New" w:hAnsi="Angsana New" w:hint="cs"/>
-          <w:sz w:val="32"/>
-          <w:szCs w:val="32"/>
-          <w:cs/>
-          <w:lang w:val="en-US"/>
-        </w:rPr>
-        <w:t>ออกมา</w:t>
-      </w:r>
-      <w:proofErr w:type="spellEnd"/>
-      <w:r>
-        <w:rPr>
-          <w:rFonts w:ascii="Angsana New" w:hAnsi="Angsana New" w:hint="cs"/>
-          <w:sz w:val="32"/>
-          <w:szCs w:val="32"/>
-          <w:cs/>
-          <w:lang w:val="en-US"/>
-        </w:rPr>
-        <w:t xml:space="preserve">จาก </w:t>
+      <w:r>
+        <w:rPr>
+          <w:rFonts w:ascii="Angsana New" w:hAnsi="Angsana New" w:hint="cs"/>
+          <w:sz w:val="32"/>
+          <w:szCs w:val="32"/>
+          <w:cs/>
+          <w:lang w:val="en-US"/>
+        </w:rPr>
+        <w:t xml:space="preserve">ออกมาจาก </w:t>
       </w:r>
       <w:r>
         <w:rPr>
@@ -743,6 +719,7 @@
       <w:r>
         <w:rPr>
           <w:rFonts w:ascii="Angsana New" w:hAnsi="Angsana New"/>
+          <w:noProof/>
           <w:sz w:val="32"/>
           <w:szCs w:val="32"/>
           <w:lang w:val="en-US"/>
@@ -794,6 +771,7 @@
       <w:r>
         <w:rPr>
           <w:rFonts w:ascii="Angsana New" w:hAnsi="Angsana New"/>
+          <w:noProof/>
           <w:sz w:val="32"/>
           <w:szCs w:val="32"/>
           <w:lang w:val="en-US"/>
@@ -1402,6 +1380,7 @@
           <w:rFonts w:ascii="Angsana New" w:hAnsi="Angsana New"/>
           <w:b/>
           <w:bCs/>
+          <w:noProof/>
           <w:sz w:val="32"/>
           <w:szCs w:val="32"/>
           <w:cs/>
@@ -1463,6 +1442,7 @@
           <w:rFonts w:ascii="Angsana New" w:hAnsi="Angsana New"/>
           <w:b/>
           <w:bCs/>
+          <w:noProof/>
           <w:sz w:val="32"/>
           <w:szCs w:val="32"/>
           <w:lang w:val="en-US"/>
@@ -1522,6 +1502,7 @@
           <w:rFonts w:ascii="Angsana New" w:hAnsi="Angsana New"/>
           <w:b/>
           <w:bCs/>
+          <w:noProof/>
           <w:sz w:val="32"/>
           <w:szCs w:val="32"/>
           <w:lang w:val="en-US"/>
@@ -2571,18 +2552,7 @@
           <w:szCs w:val="32"/>
           <w:lang w:val="en-US"/>
         </w:rPr>
-        <w:t xml:space="preserve"> </w:t>
-      </w:r>
-      <w:r>
-        <w:rPr>
-          <w:rFonts w:ascii="Angsana New" w:hAnsi="Angsana New"/>
-          <w:b/>
-          <w:bCs/>
-          <w:sz w:val="32"/>
-          <w:szCs w:val="32"/>
-          <w:lang w:val="en-US"/>
-        </w:rPr>
-        <w:t xml:space="preserve">regularization </w:t>
+        <w:t xml:space="preserve"> regularization </w:t>
       </w:r>
       <w:r>
         <w:rPr>
@@ -2609,6 +2579,7 @@
       <w:r>
         <w:rPr>
           <w:rFonts w:ascii="Angsana New" w:hAnsi="Angsana New"/>
+          <w:noProof/>
           <w:sz w:val="32"/>
           <w:szCs w:val="32"/>
           <w:cs/>
@@ -3890,7 +3861,29 @@
           <w:szCs w:val="32"/>
           <w:lang w:val="en-US"/>
         </w:rPr>
-        <w:t xml:space="preserve">Retain </w:t>
+        <w:t>Ret</w:t>
+      </w:r>
+      <w:r>
+        <w:rPr>
+          <w:rFonts w:ascii="Angsana New" w:hAnsi="Angsana New"/>
+          <w:b/>
+          <w:bCs/>
+          <w:sz w:val="32"/>
+          <w:szCs w:val="32"/>
+          <w:lang w:val="en-US"/>
+        </w:rPr>
+        <w:t>r</w:t>
+      </w:r>
+      <w:r>
+        <w:rPr>
+          <w:rFonts w:ascii="Angsana New" w:hAnsi="Angsana New"/>
+          <w:b/>
+          <w:bCs/>
+          <w:sz w:val="32"/>
+          <w:szCs w:val="32"/>
+          <w:lang w:val="en-US"/>
+        </w:rPr>
+        <w:t xml:space="preserve">ain </w:t>
       </w:r>
       <w:r>
         <w:rPr>
@@ -3975,6 +3968,7 @@
       <w:r>
         <w:rPr>
           <w:rFonts w:ascii="Angsana New" w:hAnsi="Angsana New"/>
+          <w:noProof/>
           <w:sz w:val="32"/>
           <w:szCs w:val="32"/>
           <w:lang w:val="en-US"/>
@@ -4249,29 +4243,7 @@
           <w:cs/>
           <w:lang w:val="en-US"/>
         </w:rPr>
-        <w:t>ทำแบบทดสอบ</w:t>
-      </w:r>
-      <w:proofErr w:type="spellStart"/>
-      <w:r>
-        <w:rPr>
-          <w:rFonts w:ascii="Angsana New" w:hAnsi="Angsana New" w:hint="cs"/>
-          <w:sz w:val="32"/>
-          <w:szCs w:val="32"/>
-          <w:cs/>
-          <w:lang w:val="en-US"/>
-        </w:rPr>
-        <w:t>ออกมา</w:t>
-      </w:r>
-      <w:proofErr w:type="spellEnd"/>
-      <w:r>
-        <w:rPr>
-          <w:rFonts w:ascii="Angsana New" w:hAnsi="Angsana New" w:hint="cs"/>
-          <w:sz w:val="32"/>
-          <w:szCs w:val="32"/>
-          <w:cs/>
-          <w:lang w:val="en-US"/>
-        </w:rPr>
-        <w:t>ได้ดีที่สุด โดยมีรายละเอียดการเทรน ดังนี้</w:t>
+        <w:t>ทำแบบทดสอบออกมาได้ดีที่สุด โดยมีรายละเอียดการเทรน ดังนี้</w:t>
       </w:r>
     </w:p>
     <w:p>
@@ -4430,7 +4402,7 @@
         <w:spacing w:after="0" w:line="240" w:lineRule="auto"/>
         <w:jc w:val="thaiDistribute"/>
         <w:rPr>
-          <w:rFonts w:ascii="Angsana New" w:hAnsi="Angsana New" w:hint="cs"/>
+          <w:rFonts w:ascii="Angsana New" w:hAnsi="Angsana New"/>
           <w:sz w:val="32"/>
           <w:szCs w:val="32"/>
           <w:lang w:val="en-US"/>
@@ -4474,6 +4446,2151 @@
           <w:lang w:val="en-US"/>
         </w:rPr>
         <w:t xml:space="preserve"> 0.983</w:t>
+      </w:r>
+    </w:p>
+    <w:p>
+      <w:pPr>
+        <w:rPr>
+          <w:rFonts w:ascii="Angsana New" w:hAnsi="Angsana New"/>
+          <w:sz w:val="32"/>
+          <w:szCs w:val="32"/>
+          <w:lang w:val="en-US"/>
+        </w:rPr>
+      </w:pPr>
+      <w:r>
+        <w:rPr>
+          <w:rFonts w:ascii="Angsana New" w:hAnsi="Angsana New"/>
+          <w:sz w:val="32"/>
+          <w:szCs w:val="32"/>
+          <w:lang w:val="en-US"/>
+        </w:rPr>
+        <w:br w:type="page"/>
+      </w:r>
+    </w:p>
+    <w:p>
+      <w:pPr>
+        <w:jc w:val="thaiDistribute"/>
+        <w:rPr>
+          <w:rFonts w:ascii="Angsana New" w:hAnsi="Angsana New"/>
+          <w:b/>
+          <w:bCs/>
+          <w:sz w:val="32"/>
+          <w:szCs w:val="32"/>
+          <w:lang w:val="en-US"/>
+        </w:rPr>
+      </w:pPr>
+      <w:r>
+        <w:rPr>
+          <w:rFonts w:ascii="Angsana New" w:hAnsi="Angsana New"/>
+          <w:sz w:val="32"/>
+          <w:szCs w:val="32"/>
+          <w:lang w:val="en-US"/>
+        </w:rPr>
+        <w:lastRenderedPageBreak/>
+        <w:drawing>
+          <wp:anchor distT="0" distB="0" distL="114300" distR="114300" simplePos="0" relativeHeight="251684864" behindDoc="0" locked="0" layoutInCell="1" allowOverlap="1" wp14:anchorId="54DF25F2" wp14:editId="6454B2FF">
+            <wp:simplePos x="0" y="0"/>
+            <wp:positionH relativeFrom="column">
+              <wp:posOffset>4886748</wp:posOffset>
+            </wp:positionH>
+            <wp:positionV relativeFrom="page">
+              <wp:posOffset>887095</wp:posOffset>
+            </wp:positionV>
+            <wp:extent cx="1611630" cy="1611630"/>
+            <wp:effectExtent l="0" t="0" r="1270" b="1270"/>
+            <wp:wrapNone/>
+            <wp:docPr id="1638972701" name="Picture 1" descr="A number on a black background&#10;&#10;AI-generated content may be incorrect."/>
+            <wp:cNvGraphicFramePr>
+              <a:graphicFrameLocks xmlns:a="http://schemas.openxmlformats.org/drawingml/2006/main" noChangeAspect="1"/>
+            </wp:cNvGraphicFramePr>
+            <a:graphic xmlns:a="http://schemas.openxmlformats.org/drawingml/2006/main">
+              <a:graphicData uri="http://schemas.openxmlformats.org/drawingml/2006/picture">
+                <pic:pic xmlns:pic="http://schemas.openxmlformats.org/drawingml/2006/picture">
+                  <pic:nvPicPr>
+                    <pic:cNvPr id="1638972701" name="Picture 1" descr="A number on a black background&#10;&#10;AI-generated content may be incorrect."/>
+                    <pic:cNvPicPr/>
+                  </pic:nvPicPr>
+                  <pic:blipFill>
+                    <a:blip r:embed="rId10"/>
+                    <a:stretch>
+                      <a:fillRect/>
+                    </a:stretch>
+                  </pic:blipFill>
+                  <pic:spPr>
+                    <a:xfrm>
+                      <a:off x="0" y="0"/>
+                      <a:ext cx="1611630" cy="1611630"/>
+                    </a:xfrm>
+                    <a:prstGeom prst="rect">
+                      <a:avLst/>
+                    </a:prstGeom>
+                  </pic:spPr>
+                </pic:pic>
+              </a:graphicData>
+            </a:graphic>
+            <wp14:sizeRelH relativeFrom="margin">
+              <wp14:pctWidth>0</wp14:pctWidth>
+            </wp14:sizeRelH>
+            <wp14:sizeRelV relativeFrom="margin">
+              <wp14:pctHeight>0</wp14:pctHeight>
+            </wp14:sizeRelV>
+          </wp:anchor>
+        </w:drawing>
+      </w:r>
+      <w:r>
+        <w:rPr>
+          <w:rFonts w:ascii="Angsana New" w:hAnsi="Angsana New"/>
+          <w:sz w:val="32"/>
+          <w:szCs w:val="32"/>
+          <w:lang w:val="en-US"/>
+        </w:rPr>
+        <w:drawing>
+          <wp:anchor distT="0" distB="0" distL="114300" distR="114300" simplePos="0" relativeHeight="251680768" behindDoc="0" locked="0" layoutInCell="1" allowOverlap="1" wp14:anchorId="3BF9DDC3" wp14:editId="2063C232">
+            <wp:simplePos x="0" y="0"/>
+            <wp:positionH relativeFrom="column">
+              <wp:posOffset>2448348</wp:posOffset>
+            </wp:positionH>
+            <wp:positionV relativeFrom="page">
+              <wp:posOffset>887095</wp:posOffset>
+            </wp:positionV>
+            <wp:extent cx="1625600" cy="1625600"/>
+            <wp:effectExtent l="0" t="0" r="0" b="0"/>
+            <wp:wrapNone/>
+            <wp:docPr id="196665857" name="Picture 1" descr="A pixelated image of a number one&#10;&#10;AI-generated content may be incorrect."/>
+            <wp:cNvGraphicFramePr>
+              <a:graphicFrameLocks xmlns:a="http://schemas.openxmlformats.org/drawingml/2006/main" noChangeAspect="1"/>
+            </wp:cNvGraphicFramePr>
+            <a:graphic xmlns:a="http://schemas.openxmlformats.org/drawingml/2006/main">
+              <a:graphicData uri="http://schemas.openxmlformats.org/drawingml/2006/picture">
+                <pic:pic xmlns:pic="http://schemas.openxmlformats.org/drawingml/2006/picture">
+                  <pic:nvPicPr>
+                    <pic:cNvPr id="196665857" name="Picture 1" descr="A pixelated image of a number one&#10;&#10;AI-generated content may be incorrect."/>
+                    <pic:cNvPicPr/>
+                  </pic:nvPicPr>
+                  <pic:blipFill>
+                    <a:blip r:embed="rId11"/>
+                    <a:stretch>
+                      <a:fillRect/>
+                    </a:stretch>
+                  </pic:blipFill>
+                  <pic:spPr>
+                    <a:xfrm>
+                      <a:off x="0" y="0"/>
+                      <a:ext cx="1625600" cy="1625600"/>
+                    </a:xfrm>
+                    <a:prstGeom prst="rect">
+                      <a:avLst/>
+                    </a:prstGeom>
+                  </pic:spPr>
+                </pic:pic>
+              </a:graphicData>
+            </a:graphic>
+            <wp14:sizeRelH relativeFrom="margin">
+              <wp14:pctWidth>0</wp14:pctWidth>
+            </wp14:sizeRelH>
+            <wp14:sizeRelV relativeFrom="margin">
+              <wp14:pctHeight>0</wp14:pctHeight>
+            </wp14:sizeRelV>
+          </wp:anchor>
+        </w:drawing>
+      </w:r>
+      <w:r>
+        <w:rPr>
+          <w:rFonts w:ascii="Angsana New" w:hAnsi="Angsana New"/>
+          <w:sz w:val="32"/>
+          <w:szCs w:val="32"/>
+          <w:lang w:val="en-US"/>
+        </w:rPr>
+        <w:drawing>
+          <wp:anchor distT="0" distB="0" distL="114300" distR="114300" simplePos="0" relativeHeight="251677696" behindDoc="0" locked="0" layoutInCell="1" allowOverlap="1" wp14:anchorId="31491CF7" wp14:editId="2E1DBEAC">
+            <wp:simplePos x="0" y="0"/>
+            <wp:positionH relativeFrom="column">
+              <wp:posOffset>3387</wp:posOffset>
+            </wp:positionH>
+            <wp:positionV relativeFrom="page">
+              <wp:posOffset>887095</wp:posOffset>
+            </wp:positionV>
+            <wp:extent cx="1611630" cy="1611630"/>
+            <wp:effectExtent l="0" t="0" r="1270" b="1270"/>
+            <wp:wrapNone/>
+            <wp:docPr id="756013207" name="Picture 1" descr="A pixelated image of a triangle&#10;&#10;AI-generated content may be incorrect."/>
+            <wp:cNvGraphicFramePr>
+              <a:graphicFrameLocks xmlns:a="http://schemas.openxmlformats.org/drawingml/2006/main" noChangeAspect="1"/>
+            </wp:cNvGraphicFramePr>
+            <a:graphic xmlns:a="http://schemas.openxmlformats.org/drawingml/2006/main">
+              <a:graphicData uri="http://schemas.openxmlformats.org/drawingml/2006/picture">
+                <pic:pic xmlns:pic="http://schemas.openxmlformats.org/drawingml/2006/picture">
+                  <pic:nvPicPr>
+                    <pic:cNvPr id="756013207" name="Picture 1" descr="A pixelated image of a triangle&#10;&#10;AI-generated content may be incorrect."/>
+                    <pic:cNvPicPr/>
+                  </pic:nvPicPr>
+                  <pic:blipFill>
+                    <a:blip r:embed="rId12"/>
+                    <a:stretch>
+                      <a:fillRect/>
+                    </a:stretch>
+                  </pic:blipFill>
+                  <pic:spPr>
+                    <a:xfrm>
+                      <a:off x="0" y="0"/>
+                      <a:ext cx="1611630" cy="1611630"/>
+                    </a:xfrm>
+                    <a:prstGeom prst="rect">
+                      <a:avLst/>
+                    </a:prstGeom>
+                  </pic:spPr>
+                </pic:pic>
+              </a:graphicData>
+            </a:graphic>
+            <wp14:sizeRelH relativeFrom="margin">
+              <wp14:pctWidth>0</wp14:pctWidth>
+            </wp14:sizeRelH>
+            <wp14:sizeRelV relativeFrom="margin">
+              <wp14:pctHeight>0</wp14:pctHeight>
+            </wp14:sizeRelV>
+          </wp:anchor>
+        </w:drawing>
+      </w:r>
+      <w:r>
+        <w:rPr>
+          <w:rFonts w:ascii="Angsana New" w:hAnsi="Angsana New"/>
+          <w:b/>
+          <w:bCs/>
+          <w:sz w:val="32"/>
+          <w:szCs w:val="32"/>
+          <w:lang w:val="en-US"/>
+        </w:rPr>
+        <w:t>6</w:t>
+      </w:r>
+      <w:r>
+        <w:rPr>
+          <w:rFonts w:ascii="Angsana New" w:hAnsi="Angsana New"/>
+          <w:b/>
+          <w:bCs/>
+          <w:sz w:val="32"/>
+          <w:szCs w:val="32"/>
+          <w:lang w:val="en-US"/>
+        </w:rPr>
+        <w:t xml:space="preserve">. </w:t>
+      </w:r>
+      <w:r>
+        <w:rPr>
+          <w:rFonts w:ascii="Angsana New" w:hAnsi="Angsana New"/>
+          <w:b/>
+          <w:bCs/>
+          <w:sz w:val="32"/>
+          <w:szCs w:val="32"/>
+          <w:cs/>
+          <w:lang w:val="en-US"/>
+        </w:rPr>
+        <w:t xml:space="preserve">วาดรูปคนละรูปรวม </w:t>
+      </w:r>
+      <w:r>
+        <w:rPr>
+          <w:rFonts w:ascii="Angsana New" w:hAnsi="Angsana New"/>
+          <w:b/>
+          <w:bCs/>
+          <w:sz w:val="32"/>
+          <w:szCs w:val="32"/>
+          <w:lang w:val="en-US"/>
+        </w:rPr>
+        <w:t>3-4</w:t>
+      </w:r>
+      <w:r>
+        <w:rPr>
+          <w:rFonts w:ascii="Angsana New" w:hAnsi="Angsana New"/>
+          <w:b/>
+          <w:bCs/>
+          <w:sz w:val="32"/>
+          <w:szCs w:val="32"/>
+          <w:cs/>
+          <w:lang w:val="en-US"/>
+        </w:rPr>
+        <w:t xml:space="preserve"> รูป</w:t>
+      </w:r>
+      <w:r>
+        <w:rPr>
+          <w:rFonts w:ascii="Angsana New" w:hAnsi="Angsana New"/>
+          <w:b/>
+          <w:bCs/>
+          <w:sz w:val="32"/>
+          <w:szCs w:val="32"/>
+          <w:lang w:val="en-US"/>
+        </w:rPr>
+        <w:t xml:space="preserve"> </w:t>
+      </w:r>
+      <w:r>
+        <w:rPr>
+          <w:rFonts w:ascii="Angsana New" w:hAnsi="Angsana New"/>
+          <w:b/>
+          <w:bCs/>
+          <w:sz w:val="32"/>
+          <w:szCs w:val="32"/>
+          <w:cs/>
+          <w:lang w:val="en-US"/>
+        </w:rPr>
+        <w:t>ตามจำนวนคนในกลุ่มแล้วทดสอบโมเดลที่ได้ทำนายถูกต้องไหม</w:t>
+      </w:r>
+    </w:p>
+    <w:p>
+      <w:pPr>
+        <w:rPr>
+          <w:rFonts w:ascii="Angsana New" w:hAnsi="Angsana New" w:hint="cs"/>
+          <w:sz w:val="32"/>
+          <w:szCs w:val="32"/>
+          <w:lang w:val="en-US"/>
+        </w:rPr>
+      </w:pPr>
+      <w:r>
+        <w:rPr>
+          <w:rFonts w:ascii="Angsana New" w:hAnsi="Angsana New" w:hint="cs"/>
+          <w:noProof/>
+          <w:sz w:val="32"/>
+          <w:szCs w:val="32"/>
+          <w:lang w:val="en-US"/>
+        </w:rPr>
+        <mc:AlternateContent>
+          <mc:Choice Requires="wps">
+            <w:drawing>
+              <wp:anchor distT="0" distB="0" distL="114300" distR="114300" simplePos="0" relativeHeight="251678720" behindDoc="0" locked="0" layoutInCell="1" allowOverlap="1" wp14:anchorId="72BCA1C8" wp14:editId="4B9CB193">
+                <wp:simplePos x="0" y="0"/>
+                <wp:positionH relativeFrom="column">
+                  <wp:posOffset>-254000</wp:posOffset>
+                </wp:positionH>
+                <wp:positionV relativeFrom="page">
+                  <wp:posOffset>2393315</wp:posOffset>
+                </wp:positionV>
+                <wp:extent cx="2106295" cy="602615"/>
+                <wp:effectExtent l="0" t="0" r="1905" b="0"/>
+                <wp:wrapNone/>
+                <wp:docPr id="1674095818" name="Text Box 1"/>
+                <wp:cNvGraphicFramePr/>
+                <a:graphic xmlns:a="http://schemas.openxmlformats.org/drawingml/2006/main">
+                  <a:graphicData uri="http://schemas.microsoft.com/office/word/2010/wordprocessingShape">
+                    <wps:wsp>
+                      <wps:cNvSpPr txBox="1"/>
+                      <wps:spPr>
+                        <a:xfrm>
+                          <a:off x="0" y="0"/>
+                          <a:ext cx="2106295" cy="602615"/>
+                        </a:xfrm>
+                        <a:prstGeom prst="rect">
+                          <a:avLst/>
+                        </a:prstGeom>
+                        <a:solidFill>
+                          <a:schemeClr val="lt1"/>
+                        </a:solidFill>
+                        <a:ln w="6350">
+                          <a:noFill/>
+                        </a:ln>
+                      </wps:spPr>
+                      <wps:txbx>
+                        <w:txbxContent>
+                          <w:p>
+                            <w:pPr>
+                              <w:spacing w:after="0" w:line="240" w:lineRule="auto"/>
+                              <w:jc w:val="center"/>
+                            </w:pPr>
+                            <w:r>
+                              <w:rPr>
+                                <w:cs/>
+                              </w:rPr>
+                              <w:t xml:space="preserve">ผลการทำนาย: เลข </w:t>
+                            </w:r>
+                            <w:r>
+                              <w:t>0</w:t>
+                            </w:r>
+                          </w:p>
+                          <w:p>
+                            <w:pPr>
+                              <w:spacing w:after="0" w:line="240" w:lineRule="auto"/>
+                              <w:jc w:val="center"/>
+                            </w:pPr>
+                            <w:r>
+                              <w:rPr>
+                                <w:cs/>
+                              </w:rPr>
+                              <w:t xml:space="preserve">ความมั่นใจ: </w:t>
+                            </w:r>
+                            <w:r>
+                              <w:t>74.57%</w:t>
+                            </w:r>
+                          </w:p>
+                        </w:txbxContent>
+                      </wps:txbx>
+                      <wps:bodyPr rot="0" spcFirstLastPara="0" vertOverflow="overflow" horzOverflow="overflow" vert="horz" wrap="square" lIns="91440" tIns="45720" rIns="91440" bIns="45720" numCol="1" spcCol="0" rtlCol="0" fromWordArt="0" anchor="t" anchorCtr="0" forceAA="0" compatLnSpc="1">
+                        <a:prstTxWarp prst="textNoShape">
+                          <a:avLst/>
+                        </a:prstTxWarp>
+                        <a:noAutofit/>
+                      </wps:bodyPr>
+                    </wps:wsp>
+                  </a:graphicData>
+                </a:graphic>
+                <wp14:sizeRelV relativeFrom="margin">
+                  <wp14:pctHeight>0</wp14:pctHeight>
+                </wp14:sizeRelV>
+              </wp:anchor>
+            </w:drawing>
+          </mc:Choice>
+          <mc:Fallback>
+            <w:pict>
+              <v:shapetype w14:anchorId="72BCA1C8" id="_x0000_t202" coordsize="21600,21600" o:spt="202" path="m,l,21600r21600,l21600,xe">
+                <v:stroke joinstyle="miter"/>
+                <v:path gradientshapeok="t" o:connecttype="rect"/>
+              </v:shapetype>
+              <v:shape id="Text Box 1" o:spid="_x0000_s1026" type="#_x0000_t202" style="position:absolute;margin-left:-20pt;margin-top:188.45pt;width:165.85pt;height:47.45pt;z-index:251678720;visibility:visible;mso-wrap-style:square;mso-height-percent:0;mso-wrap-distance-left:9pt;mso-wrap-distance-top:0;mso-wrap-distance-right:9pt;mso-wrap-distance-bottom:0;mso-position-horizontal:absolute;mso-position-horizontal-relative:text;mso-position-vertical:absolute;mso-position-vertical-relative:page;mso-height-percent:0;mso-height-relative:margin;v-text-anchor:top" o:gfxdata="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" fillcolor="white [3201]" stroked="f" strokeweight=".5pt">
+                <v:textbox>
+                  <w:txbxContent>
+                    <w:p>
+                      <w:pPr>
+                        <w:spacing w:after="0" w:line="240" w:lineRule="auto"/>
+                        <w:jc w:val="center"/>
+                      </w:pPr>
+                      <w:r>
+                        <w:rPr>
+                          <w:cs/>
+                        </w:rPr>
+                        <w:t xml:space="preserve">ผลการทำนาย: เลข </w:t>
+                      </w:r>
+                      <w:r>
+                        <w:t>0</w:t>
+                      </w:r>
+                    </w:p>
+                    <w:p>
+                      <w:pPr>
+                        <w:spacing w:after="0" w:line="240" w:lineRule="auto"/>
+                        <w:jc w:val="center"/>
+                      </w:pPr>
+                      <w:r>
+                        <w:rPr>
+                          <w:cs/>
+                        </w:rPr>
+                        <w:t xml:space="preserve">ความมั่นใจ: </w:t>
+                      </w:r>
+                      <w:r>
+                        <w:t>74.57%</w:t>
+                      </w:r>
+                    </w:p>
+                  </w:txbxContent>
+                </v:textbox>
+                <w10:wrap anchory="page"/>
+              </v:shape>
+            </w:pict>
+          </mc:Fallback>
+        </mc:AlternateContent>
+      </w:r>
+      <w:r>
+        <w:rPr>
+          <w:rFonts w:ascii="Angsana New" w:hAnsi="Angsana New" w:hint="cs"/>
+          <w:noProof/>
+          <w:sz w:val="32"/>
+          <w:szCs w:val="32"/>
+          <w:lang w:val="en-US"/>
+        </w:rPr>
+        <mc:AlternateContent>
+          <mc:Choice Requires="wps">
+            <w:drawing>
+              <wp:anchor distT="0" distB="0" distL="114300" distR="114300" simplePos="0" relativeHeight="251682816" behindDoc="0" locked="0" layoutInCell="1" allowOverlap="1" wp14:anchorId="2D22181E" wp14:editId="72413BB6">
+                <wp:simplePos x="0" y="0"/>
+                <wp:positionH relativeFrom="column">
+                  <wp:posOffset>2244725</wp:posOffset>
+                </wp:positionH>
+                <wp:positionV relativeFrom="page">
+                  <wp:posOffset>2393315</wp:posOffset>
+                </wp:positionV>
+                <wp:extent cx="2106295" cy="602615"/>
+                <wp:effectExtent l="0" t="0" r="1905" b="0"/>
+                <wp:wrapNone/>
+                <wp:docPr id="304948815" name="Text Box 1"/>
+                <wp:cNvGraphicFramePr/>
+                <a:graphic xmlns:a="http://schemas.openxmlformats.org/drawingml/2006/main">
+                  <a:graphicData uri="http://schemas.microsoft.com/office/word/2010/wordprocessingShape">
+                    <wps:wsp>
+                      <wps:cNvSpPr txBox="1"/>
+                      <wps:spPr>
+                        <a:xfrm>
+                          <a:off x="0" y="0"/>
+                          <a:ext cx="2106295" cy="602615"/>
+                        </a:xfrm>
+                        <a:prstGeom prst="rect">
+                          <a:avLst/>
+                        </a:prstGeom>
+                        <a:solidFill>
+                          <a:schemeClr val="lt1"/>
+                        </a:solidFill>
+                        <a:ln w="6350">
+                          <a:noFill/>
+                        </a:ln>
+                      </wps:spPr>
+                      <wps:txbx>
+                        <w:txbxContent>
+                          <w:p>
+                            <w:pPr>
+                              <w:spacing w:after="0" w:line="240" w:lineRule="auto"/>
+                              <w:jc w:val="center"/>
+                            </w:pPr>
+                            <w:r>
+                              <w:rPr>
+                                <w:cs/>
+                              </w:rPr>
+                              <w:t>ผลการทำนาย: เลข 1</w:t>
+                            </w:r>
+                          </w:p>
+                          <w:p>
+                            <w:pPr>
+                              <w:spacing w:after="0" w:line="240" w:lineRule="auto"/>
+                              <w:jc w:val="center"/>
+                            </w:pPr>
+                            <w:r>
+                              <w:rPr>
+                                <w:cs/>
+                              </w:rPr>
+                              <w:t>ความมั่นใจ: 99.94%</w:t>
+                            </w:r>
+                          </w:p>
+                        </w:txbxContent>
+                      </wps:txbx>
+                      <wps:bodyPr rot="0" spcFirstLastPara="0" vertOverflow="overflow" horzOverflow="overflow" vert="horz" wrap="square" lIns="91440" tIns="45720" rIns="91440" bIns="45720" numCol="1" spcCol="0" rtlCol="0" fromWordArt="0" anchor="t" anchorCtr="0" forceAA="0" compatLnSpc="1">
+                        <a:prstTxWarp prst="textNoShape">
+                          <a:avLst/>
+                        </a:prstTxWarp>
+                        <a:noAutofit/>
+                      </wps:bodyPr>
+                    </wps:wsp>
+                  </a:graphicData>
+                </a:graphic>
+                <wp14:sizeRelV relativeFrom="margin">
+                  <wp14:pctHeight>0</wp14:pctHeight>
+                </wp14:sizeRelV>
+              </wp:anchor>
+            </w:drawing>
+          </mc:Choice>
+          <mc:Fallback>
+            <w:pict>
+              <v:shape w14:anchorId="2D22181E" id="_x0000_s1027" type="#_x0000_t202" style="position:absolute;margin-left:176.75pt;margin-top:188.45pt;width:165.85pt;height:47.45pt;z-index:251682816;visibility:visible;mso-wrap-style:square;mso-height-percent:0;mso-wrap-distance-left:9pt;mso-wrap-distance-top:0;mso-wrap-distance-right:9pt;mso-wrap-distance-bottom:0;mso-position-horizontal:absolute;mso-position-horizontal-relative:text;mso-position-vertical:absolute;mso-position-vertical-relative:page;mso-height-percent:0;mso-height-relative:margin;v-text-anchor:top" o:gfxdata="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" fillcolor="white [3201]" stroked="f" strokeweight=".5pt">
+                <v:textbox>
+                  <w:txbxContent>
+                    <w:p>
+                      <w:pPr>
+                        <w:spacing w:after="0" w:line="240" w:lineRule="auto"/>
+                        <w:jc w:val="center"/>
+                      </w:pPr>
+                      <w:r>
+                        <w:rPr>
+                          <w:cs/>
+                        </w:rPr>
+                        <w:t>ผลการทำนาย: เลข 1</w:t>
+                      </w:r>
+                    </w:p>
+                    <w:p>
+                      <w:pPr>
+                        <w:spacing w:after="0" w:line="240" w:lineRule="auto"/>
+                        <w:jc w:val="center"/>
+                      </w:pPr>
+                      <w:r>
+                        <w:rPr>
+                          <w:cs/>
+                        </w:rPr>
+                        <w:t>ความมั่นใจ: 99.94%</w:t>
+                      </w:r>
+                    </w:p>
+                  </w:txbxContent>
+                </v:textbox>
+                <w10:wrap anchory="page"/>
+              </v:shape>
+            </w:pict>
+          </mc:Fallback>
+        </mc:AlternateContent>
+      </w:r>
+      <w:r>
+        <w:rPr>
+          <w:rFonts w:ascii="Angsana New" w:hAnsi="Angsana New" w:hint="cs"/>
+          <w:noProof/>
+          <w:sz w:val="32"/>
+          <w:szCs w:val="32"/>
+          <w:lang w:val="en-US"/>
+        </w:rPr>
+        <mc:AlternateContent>
+          <mc:Choice Requires="wps">
+            <w:drawing>
+              <wp:anchor distT="0" distB="0" distL="114300" distR="114300" simplePos="0" relativeHeight="251686912" behindDoc="0" locked="0" layoutInCell="1" allowOverlap="1" wp14:anchorId="1CC4FC87" wp14:editId="6E2A9273">
+                <wp:simplePos x="0" y="0"/>
+                <wp:positionH relativeFrom="column">
+                  <wp:posOffset>4669155</wp:posOffset>
+                </wp:positionH>
+                <wp:positionV relativeFrom="page">
+                  <wp:posOffset>2393315</wp:posOffset>
+                </wp:positionV>
+                <wp:extent cx="2106295" cy="602615"/>
+                <wp:effectExtent l="0" t="0" r="1905" b="0"/>
+                <wp:wrapNone/>
+                <wp:docPr id="1414820620" name="Text Box 1"/>
+                <wp:cNvGraphicFramePr/>
+                <a:graphic xmlns:a="http://schemas.openxmlformats.org/drawingml/2006/main">
+                  <a:graphicData uri="http://schemas.microsoft.com/office/word/2010/wordprocessingShape">
+                    <wps:wsp>
+                      <wps:cNvSpPr txBox="1"/>
+                      <wps:spPr>
+                        <a:xfrm>
+                          <a:off x="0" y="0"/>
+                          <a:ext cx="2106295" cy="602615"/>
+                        </a:xfrm>
+                        <a:prstGeom prst="rect">
+                          <a:avLst/>
+                        </a:prstGeom>
+                        <a:solidFill>
+                          <a:schemeClr val="lt1"/>
+                        </a:solidFill>
+                        <a:ln w="6350">
+                          <a:noFill/>
+                        </a:ln>
+                      </wps:spPr>
+                      <wps:txbx>
+                        <w:txbxContent>
+                          <w:p>
+                            <w:pPr>
+                              <w:spacing w:after="0" w:line="240" w:lineRule="auto"/>
+                              <w:jc w:val="center"/>
+                            </w:pPr>
+                            <w:r>
+                              <w:rPr>
+                                <w:cs/>
+                              </w:rPr>
+                              <w:t>ผลการทำนาย: เลข 2</w:t>
+                            </w:r>
+                          </w:p>
+                          <w:p>
+                            <w:pPr>
+                              <w:spacing w:after="0" w:line="240" w:lineRule="auto"/>
+                              <w:jc w:val="center"/>
+                            </w:pPr>
+                            <w:r>
+                              <w:rPr>
+                                <w:cs/>
+                              </w:rPr>
+                              <w:t>ความมั่นใจ: 87.31%</w:t>
+                            </w:r>
+                          </w:p>
+                        </w:txbxContent>
+                      </wps:txbx>
+                      <wps:bodyPr rot="0" spcFirstLastPara="0" vertOverflow="overflow" horzOverflow="overflow" vert="horz" wrap="square" lIns="91440" tIns="45720" rIns="91440" bIns="45720" numCol="1" spcCol="0" rtlCol="0" fromWordArt="0" anchor="t" anchorCtr="0" forceAA="0" compatLnSpc="1">
+                        <a:prstTxWarp prst="textNoShape">
+                          <a:avLst/>
+                        </a:prstTxWarp>
+                        <a:noAutofit/>
+                      </wps:bodyPr>
+                    </wps:wsp>
+                  </a:graphicData>
+                </a:graphic>
+                <wp14:sizeRelV relativeFrom="margin">
+                  <wp14:pctHeight>0</wp14:pctHeight>
+                </wp14:sizeRelV>
+              </wp:anchor>
+            </w:drawing>
+          </mc:Choice>
+          <mc:Fallback>
+            <w:pict>
+              <v:shape w14:anchorId="1CC4FC87" id="_x0000_s1028" type="#_x0000_t202" style="position:absolute;margin-left:367.65pt;margin-top:188.45pt;width:165.85pt;height:47.45pt;z-index:251686912;visibility:visible;mso-wrap-style:square;mso-height-percent:0;mso-wrap-distance-left:9pt;mso-wrap-distance-top:0;mso-wrap-distance-right:9pt;mso-wrap-distance-bottom:0;mso-position-horizontal:absolute;mso-position-horizontal-relative:text;mso-position-vertical:absolute;mso-position-vertical-relative:page;mso-height-percent:0;mso-height-relative:margin;v-text-anchor:top" o:gfxdata="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" fillcolor="white [3201]" stroked="f" strokeweight=".5pt">
+                <v:textbox>
+                  <w:txbxContent>
+                    <w:p>
+                      <w:pPr>
+                        <w:spacing w:after="0" w:line="240" w:lineRule="auto"/>
+                        <w:jc w:val="center"/>
+                      </w:pPr>
+                      <w:r>
+                        <w:rPr>
+                          <w:cs/>
+                        </w:rPr>
+                        <w:t>ผลการทำนาย: เลข 2</w:t>
+                      </w:r>
+                    </w:p>
+                    <w:p>
+                      <w:pPr>
+                        <w:spacing w:after="0" w:line="240" w:lineRule="auto"/>
+                        <w:jc w:val="center"/>
+                      </w:pPr>
+                      <w:r>
+                        <w:rPr>
+                          <w:cs/>
+                        </w:rPr>
+                        <w:t>ความมั่นใจ: 87.31%</w:t>
+                      </w:r>
+                    </w:p>
+                  </w:txbxContent>
+                </v:textbox>
+                <w10:wrap anchory="page"/>
+              </v:shape>
+            </w:pict>
+          </mc:Fallback>
+        </mc:AlternateContent>
+      </w:r>
+      <w:r>
+        <w:rPr>
+          <w:rFonts w:ascii="Angsana New" w:hAnsi="Angsana New"/>
+          <w:sz w:val="32"/>
+          <w:szCs w:val="32"/>
+          <w:cs/>
+          <w:lang w:val="en-US"/>
+        </w:rPr>
+        <w:drawing>
+          <wp:anchor distT="0" distB="0" distL="114300" distR="114300" simplePos="0" relativeHeight="251688960" behindDoc="0" locked="0" layoutInCell="1" allowOverlap="1" wp14:anchorId="28DCA958" wp14:editId="0437DD1F">
+            <wp:simplePos x="0" y="0"/>
+            <wp:positionH relativeFrom="column">
+              <wp:posOffset>4445</wp:posOffset>
+            </wp:positionH>
+            <wp:positionV relativeFrom="page">
+              <wp:posOffset>3252470</wp:posOffset>
+            </wp:positionV>
+            <wp:extent cx="1665605" cy="1665605"/>
+            <wp:effectExtent l="0" t="0" r="0" b="0"/>
+            <wp:wrapNone/>
+            <wp:docPr id="2048537627" name="Picture 1" descr="A number on a black background&#10;&#10;AI-generated content may be incorrect."/>
+            <wp:cNvGraphicFramePr>
+              <a:graphicFrameLocks xmlns:a="http://schemas.openxmlformats.org/drawingml/2006/main" noChangeAspect="1"/>
+            </wp:cNvGraphicFramePr>
+            <a:graphic xmlns:a="http://schemas.openxmlformats.org/drawingml/2006/main">
+              <a:graphicData uri="http://schemas.openxmlformats.org/drawingml/2006/picture">
+                <pic:pic xmlns:pic="http://schemas.openxmlformats.org/drawingml/2006/picture">
+                  <pic:nvPicPr>
+                    <pic:cNvPr id="2048537627" name="Picture 1" descr="A number on a black background&#10;&#10;AI-generated content may be incorrect."/>
+                    <pic:cNvPicPr/>
+                  </pic:nvPicPr>
+                  <pic:blipFill>
+                    <a:blip r:embed="rId13"/>
+                    <a:stretch>
+                      <a:fillRect/>
+                    </a:stretch>
+                  </pic:blipFill>
+                  <pic:spPr>
+                    <a:xfrm>
+                      <a:off x="0" y="0"/>
+                      <a:ext cx="1665605" cy="1665605"/>
+                    </a:xfrm>
+                    <a:prstGeom prst="rect">
+                      <a:avLst/>
+                    </a:prstGeom>
+                  </pic:spPr>
+                </pic:pic>
+              </a:graphicData>
+            </a:graphic>
+            <wp14:sizeRelH relativeFrom="margin">
+              <wp14:pctWidth>0</wp14:pctWidth>
+            </wp14:sizeRelH>
+            <wp14:sizeRelV relativeFrom="margin">
+              <wp14:pctHeight>0</wp14:pctHeight>
+            </wp14:sizeRelV>
+          </wp:anchor>
+        </w:drawing>
+      </w:r>
+      <w:r>
+        <w:rPr>
+          <w:rFonts w:ascii="Angsana New" w:hAnsi="Angsana New" w:hint="cs"/>
+          <w:noProof/>
+          <w:sz w:val="32"/>
+          <w:szCs w:val="32"/>
+          <w:lang w:val="en-US"/>
+        </w:rPr>
+        <mc:AlternateContent>
+          <mc:Choice Requires="wps">
+            <w:drawing>
+              <wp:anchor distT="0" distB="0" distL="114300" distR="114300" simplePos="0" relativeHeight="251691008" behindDoc="0" locked="0" layoutInCell="1" allowOverlap="1" wp14:anchorId="3F1BEE3A" wp14:editId="21D50545">
+                <wp:simplePos x="0" y="0"/>
+                <wp:positionH relativeFrom="column">
+                  <wp:posOffset>-254000</wp:posOffset>
+                </wp:positionH>
+                <wp:positionV relativeFrom="page">
+                  <wp:posOffset>5000625</wp:posOffset>
+                </wp:positionV>
+                <wp:extent cx="2106295" cy="602615"/>
+                <wp:effectExtent l="0" t="0" r="1905" b="0"/>
+                <wp:wrapNone/>
+                <wp:docPr id="143786151" name="Text Box 1"/>
+                <wp:cNvGraphicFramePr/>
+                <a:graphic xmlns:a="http://schemas.openxmlformats.org/drawingml/2006/main">
+                  <a:graphicData uri="http://schemas.microsoft.com/office/word/2010/wordprocessingShape">
+                    <wps:wsp>
+                      <wps:cNvSpPr txBox="1"/>
+                      <wps:spPr>
+                        <a:xfrm>
+                          <a:off x="0" y="0"/>
+                          <a:ext cx="2106295" cy="602615"/>
+                        </a:xfrm>
+                        <a:prstGeom prst="rect">
+                          <a:avLst/>
+                        </a:prstGeom>
+                        <a:solidFill>
+                          <a:schemeClr val="lt1"/>
+                        </a:solidFill>
+                        <a:ln w="6350">
+                          <a:noFill/>
+                        </a:ln>
+                      </wps:spPr>
+                      <wps:txbx>
+                        <w:txbxContent>
+                          <w:p>
+                            <w:pPr>
+                              <w:spacing w:after="0" w:line="240" w:lineRule="auto"/>
+                              <w:jc w:val="center"/>
+                            </w:pPr>
+                            <w:r>
+                              <w:rPr>
+                                <w:cs/>
+                              </w:rPr>
+                              <w:t>ผลการทำนาย: เลข 3</w:t>
+                            </w:r>
+                          </w:p>
+                          <w:p>
+                            <w:pPr>
+                              <w:spacing w:after="0" w:line="240" w:lineRule="auto"/>
+                              <w:jc w:val="center"/>
+                              <w:rPr>
+                                <w:sz w:val="28"/>
+                                <w:szCs w:val="28"/>
+                              </w:rPr>
+                            </w:pPr>
+                            <w:r>
+                              <w:rPr>
+                                <w:cs/>
+                              </w:rPr>
+                              <w:t>ความมั่นใจ: 100.00%</w:t>
+                            </w:r>
+                          </w:p>
+                        </w:txbxContent>
+                      </wps:txbx>
+                      <wps:bodyPr rot="0" spcFirstLastPara="0" vertOverflow="overflow" horzOverflow="overflow" vert="horz" wrap="square" lIns="91440" tIns="45720" rIns="91440" bIns="45720" numCol="1" spcCol="0" rtlCol="0" fromWordArt="0" anchor="t" anchorCtr="0" forceAA="0" compatLnSpc="1">
+                        <a:prstTxWarp prst="textNoShape">
+                          <a:avLst/>
+                        </a:prstTxWarp>
+                        <a:noAutofit/>
+                      </wps:bodyPr>
+                    </wps:wsp>
+                  </a:graphicData>
+                </a:graphic>
+                <wp14:sizeRelV relativeFrom="margin">
+                  <wp14:pctHeight>0</wp14:pctHeight>
+                </wp14:sizeRelV>
+              </wp:anchor>
+            </w:drawing>
+          </mc:Choice>
+          <mc:Fallback>
+            <w:pict>
+              <v:shape w14:anchorId="3F1BEE3A" id="_x0000_s1029" type="#_x0000_t202" style="position:absolute;margin-left:-20pt;margin-top:393.75pt;width:165.85pt;height:47.45pt;z-index:251691008;visibility:visible;mso-wrap-style:square;mso-height-percent:0;mso-wrap-distance-left:9pt;mso-wrap-distance-top:0;mso-wrap-distance-right:9pt;mso-wrap-distance-bottom:0;mso-position-horizontal:absolute;mso-position-horizontal-relative:text;mso-position-vertical:absolute;mso-position-vertical-relative:page;mso-height-percent:0;mso-height-relative:margin;v-text-anchor:top" o:gfxdata="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" fillcolor="white [3201]" stroked="f" strokeweight=".5pt">
+                <v:textbox>
+                  <w:txbxContent>
+                    <w:p>
+                      <w:pPr>
+                        <w:spacing w:after="0" w:line="240" w:lineRule="auto"/>
+                        <w:jc w:val="center"/>
+                      </w:pPr>
+                      <w:r>
+                        <w:rPr>
+                          <w:cs/>
+                        </w:rPr>
+                        <w:t>ผลการทำนาย: เลข 3</w:t>
+                      </w:r>
+                    </w:p>
+                    <w:p>
+                      <w:pPr>
+                        <w:spacing w:after="0" w:line="240" w:lineRule="auto"/>
+                        <w:jc w:val="center"/>
+                        <w:rPr>
+                          <w:sz w:val="28"/>
+                          <w:szCs w:val="28"/>
+                        </w:rPr>
+                      </w:pPr>
+                      <w:r>
+                        <w:rPr>
+                          <w:cs/>
+                        </w:rPr>
+                        <w:t>ความมั่นใจ: 100.00%</w:t>
+                      </w:r>
+                    </w:p>
+                  </w:txbxContent>
+                </v:textbox>
+                <w10:wrap anchory="page"/>
+              </v:shape>
+            </w:pict>
+          </mc:Fallback>
+        </mc:AlternateContent>
+      </w:r>
+      <w:r>
+        <w:rPr>
+          <w:rFonts w:ascii="Angsana New" w:hAnsi="Angsana New"/>
+          <w:sz w:val="32"/>
+          <w:szCs w:val="32"/>
+          <w:cs/>
+          <w:lang w:val="en-US"/>
+        </w:rPr>
+        <w:drawing>
+          <wp:anchor distT="0" distB="0" distL="114300" distR="114300" simplePos="0" relativeHeight="251693056" behindDoc="0" locked="0" layoutInCell="1" allowOverlap="1" wp14:anchorId="74EAAD79" wp14:editId="282801AD">
+            <wp:simplePos x="0" y="0"/>
+            <wp:positionH relativeFrom="column">
+              <wp:posOffset>2407920</wp:posOffset>
+            </wp:positionH>
+            <wp:positionV relativeFrom="page">
+              <wp:posOffset>3252470</wp:posOffset>
+            </wp:positionV>
+            <wp:extent cx="1665605" cy="1665605"/>
+            <wp:effectExtent l="0" t="0" r="0" b="0"/>
+            <wp:wrapNone/>
+            <wp:docPr id="1172101769" name="Picture 1" descr="A black and white pixelated image of a number four&#10;&#10;AI-generated content may be incorrect."/>
+            <wp:cNvGraphicFramePr>
+              <a:graphicFrameLocks xmlns:a="http://schemas.openxmlformats.org/drawingml/2006/main" noChangeAspect="1"/>
+            </wp:cNvGraphicFramePr>
+            <a:graphic xmlns:a="http://schemas.openxmlformats.org/drawingml/2006/main">
+              <a:graphicData uri="http://schemas.openxmlformats.org/drawingml/2006/picture">
+                <pic:pic xmlns:pic="http://schemas.openxmlformats.org/drawingml/2006/picture">
+                  <pic:nvPicPr>
+                    <pic:cNvPr id="1172101769" name="Picture 1" descr="A black and white pixelated image of a number four&#10;&#10;AI-generated content may be incorrect."/>
+                    <pic:cNvPicPr/>
+                  </pic:nvPicPr>
+                  <pic:blipFill>
+                    <a:blip r:embed="rId14"/>
+                    <a:stretch>
+                      <a:fillRect/>
+                    </a:stretch>
+                  </pic:blipFill>
+                  <pic:spPr>
+                    <a:xfrm>
+                      <a:off x="0" y="0"/>
+                      <a:ext cx="1665605" cy="1665605"/>
+                    </a:xfrm>
+                    <a:prstGeom prst="rect">
+                      <a:avLst/>
+                    </a:prstGeom>
+                  </pic:spPr>
+                </pic:pic>
+              </a:graphicData>
+            </a:graphic>
+            <wp14:sizeRelH relativeFrom="margin">
+              <wp14:pctWidth>0</wp14:pctWidth>
+            </wp14:sizeRelH>
+            <wp14:sizeRelV relativeFrom="margin">
+              <wp14:pctHeight>0</wp14:pctHeight>
+            </wp14:sizeRelV>
+          </wp:anchor>
+        </w:drawing>
+      </w:r>
+      <w:r>
+        <w:rPr>
+          <w:rFonts w:ascii="Angsana New" w:hAnsi="Angsana New" w:hint="cs"/>
+          <w:noProof/>
+          <w:sz w:val="32"/>
+          <w:szCs w:val="32"/>
+          <w:lang w:val="en-US"/>
+        </w:rPr>
+        <mc:AlternateContent>
+          <mc:Choice Requires="wps">
+            <w:drawing>
+              <wp:anchor distT="0" distB="0" distL="114300" distR="114300" simplePos="0" relativeHeight="251695104" behindDoc="0" locked="0" layoutInCell="1" allowOverlap="1" wp14:anchorId="3E2EF9E8" wp14:editId="15CE588E">
+                <wp:simplePos x="0" y="0"/>
+                <wp:positionH relativeFrom="column">
+                  <wp:posOffset>2190115</wp:posOffset>
+                </wp:positionH>
+                <wp:positionV relativeFrom="page">
+                  <wp:posOffset>5000625</wp:posOffset>
+                </wp:positionV>
+                <wp:extent cx="2106295" cy="602615"/>
+                <wp:effectExtent l="0" t="0" r="1905" b="0"/>
+                <wp:wrapNone/>
+                <wp:docPr id="263305328" name="Text Box 1"/>
+                <wp:cNvGraphicFramePr/>
+                <a:graphic xmlns:a="http://schemas.openxmlformats.org/drawingml/2006/main">
+                  <a:graphicData uri="http://schemas.microsoft.com/office/word/2010/wordprocessingShape">
+                    <wps:wsp>
+                      <wps:cNvSpPr txBox="1"/>
+                      <wps:spPr>
+                        <a:xfrm>
+                          <a:off x="0" y="0"/>
+                          <a:ext cx="2106295" cy="602615"/>
+                        </a:xfrm>
+                        <a:prstGeom prst="rect">
+                          <a:avLst/>
+                        </a:prstGeom>
+                        <a:solidFill>
+                          <a:schemeClr val="lt1"/>
+                        </a:solidFill>
+                        <a:ln w="6350">
+                          <a:noFill/>
+                        </a:ln>
+                      </wps:spPr>
+                      <wps:txbx>
+                        <w:txbxContent>
+                          <w:p>
+                            <w:pPr>
+                              <w:spacing w:after="0" w:line="240" w:lineRule="auto"/>
+                              <w:jc w:val="center"/>
+                            </w:pPr>
+                            <w:r>
+                              <w:rPr>
+                                <w:cs/>
+                              </w:rPr>
+                              <w:t>ผลการทำนาย: เลข 4</w:t>
+                            </w:r>
+                          </w:p>
+                          <w:p>
+                            <w:pPr>
+                              <w:spacing w:after="0" w:line="240" w:lineRule="auto"/>
+                              <w:jc w:val="center"/>
+                              <w:rPr>
+                                <w:sz w:val="28"/>
+                                <w:szCs w:val="28"/>
+                              </w:rPr>
+                            </w:pPr>
+                            <w:r>
+                              <w:rPr>
+                                <w:cs/>
+                              </w:rPr>
+                              <w:t>ความมั่นใจ: 75.92%</w:t>
+                            </w:r>
+                          </w:p>
+                        </w:txbxContent>
+                      </wps:txbx>
+                      <wps:bodyPr rot="0" spcFirstLastPara="0" vertOverflow="overflow" horzOverflow="overflow" vert="horz" wrap="square" lIns="91440" tIns="45720" rIns="91440" bIns="45720" numCol="1" spcCol="0" rtlCol="0" fromWordArt="0" anchor="t" anchorCtr="0" forceAA="0" compatLnSpc="1">
+                        <a:prstTxWarp prst="textNoShape">
+                          <a:avLst/>
+                        </a:prstTxWarp>
+                        <a:noAutofit/>
+                      </wps:bodyPr>
+                    </wps:wsp>
+                  </a:graphicData>
+                </a:graphic>
+                <wp14:sizeRelV relativeFrom="margin">
+                  <wp14:pctHeight>0</wp14:pctHeight>
+                </wp14:sizeRelV>
+              </wp:anchor>
+            </w:drawing>
+          </mc:Choice>
+          <mc:Fallback>
+            <w:pict>
+              <v:shape w14:anchorId="3E2EF9E8" id="_x0000_s1030" type="#_x0000_t202" style="position:absolute;margin-left:172.45pt;margin-top:393.75pt;width:165.85pt;height:47.45pt;z-index:251695104;visibility:visible;mso-wrap-style:square;mso-height-percent:0;mso-wrap-distance-left:9pt;mso-wrap-distance-top:0;mso-wrap-distance-right:9pt;mso-wrap-distance-bottom:0;mso-position-horizontal:absolute;mso-position-horizontal-relative:text;mso-position-vertical:absolute;mso-position-vertical-relative:page;mso-height-percent:0;mso-height-relative:margin;v-text-anchor:top" o:gfxdata="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" fillcolor="white [3201]" stroked="f" strokeweight=".5pt">
+                <v:textbox>
+                  <w:txbxContent>
+                    <w:p>
+                      <w:pPr>
+                        <w:spacing w:after="0" w:line="240" w:lineRule="auto"/>
+                        <w:jc w:val="center"/>
+                      </w:pPr>
+                      <w:r>
+                        <w:rPr>
+                          <w:cs/>
+                        </w:rPr>
+                        <w:t>ผลการทำนาย: เลข 4</w:t>
+                      </w:r>
+                    </w:p>
+                    <w:p>
+                      <w:pPr>
+                        <w:spacing w:after="0" w:line="240" w:lineRule="auto"/>
+                        <w:jc w:val="center"/>
+                        <w:rPr>
+                          <w:sz w:val="28"/>
+                          <w:szCs w:val="28"/>
+                        </w:rPr>
+                      </w:pPr>
+                      <w:r>
+                        <w:rPr>
+                          <w:cs/>
+                        </w:rPr>
+                        <w:t>ความมั่นใจ: 75.92%</w:t>
+                      </w:r>
+                    </w:p>
+                  </w:txbxContent>
+                </v:textbox>
+                <w10:wrap anchory="page"/>
+              </v:shape>
+            </w:pict>
+          </mc:Fallback>
+        </mc:AlternateContent>
+      </w:r>
+      <w:r>
+        <w:rPr>
+          <w:rFonts w:ascii="Angsana New" w:hAnsi="Angsana New"/>
+          <w:sz w:val="32"/>
+          <w:szCs w:val="32"/>
+          <w:cs/>
+          <w:lang w:val="en-US"/>
+        </w:rPr>
+        <w:drawing>
+          <wp:anchor distT="0" distB="0" distL="114300" distR="114300" simplePos="0" relativeHeight="251697152" behindDoc="0" locked="0" layoutInCell="1" allowOverlap="1" wp14:anchorId="5636D8D2" wp14:editId="27557DF8">
+            <wp:simplePos x="0" y="0"/>
+            <wp:positionH relativeFrom="column">
+              <wp:posOffset>4883785</wp:posOffset>
+            </wp:positionH>
+            <wp:positionV relativeFrom="page">
+              <wp:posOffset>3253105</wp:posOffset>
+            </wp:positionV>
+            <wp:extent cx="1665605" cy="1665605"/>
+            <wp:effectExtent l="0" t="0" r="0" b="0"/>
+            <wp:wrapNone/>
+            <wp:docPr id="2048348886" name="Picture 1" descr="A number on a black background&#10;&#10;AI-generated content may be incorrect."/>
+            <wp:cNvGraphicFramePr>
+              <a:graphicFrameLocks xmlns:a="http://schemas.openxmlformats.org/drawingml/2006/main" noChangeAspect="1"/>
+            </wp:cNvGraphicFramePr>
+            <a:graphic xmlns:a="http://schemas.openxmlformats.org/drawingml/2006/main">
+              <a:graphicData uri="http://schemas.openxmlformats.org/drawingml/2006/picture">
+                <pic:pic xmlns:pic="http://schemas.openxmlformats.org/drawingml/2006/picture">
+                  <pic:nvPicPr>
+                    <pic:cNvPr id="2048348886" name="Picture 1" descr="A number on a black background&#10;&#10;AI-generated content may be incorrect."/>
+                    <pic:cNvPicPr/>
+                  </pic:nvPicPr>
+                  <pic:blipFill>
+                    <a:blip r:embed="rId15"/>
+                    <a:stretch>
+                      <a:fillRect/>
+                    </a:stretch>
+                  </pic:blipFill>
+                  <pic:spPr>
+                    <a:xfrm>
+                      <a:off x="0" y="0"/>
+                      <a:ext cx="1665605" cy="1665605"/>
+                    </a:xfrm>
+                    <a:prstGeom prst="rect">
+                      <a:avLst/>
+                    </a:prstGeom>
+                  </pic:spPr>
+                </pic:pic>
+              </a:graphicData>
+            </a:graphic>
+            <wp14:sizeRelH relativeFrom="margin">
+              <wp14:pctWidth>0</wp14:pctWidth>
+            </wp14:sizeRelH>
+            <wp14:sizeRelV relativeFrom="margin">
+              <wp14:pctHeight>0</wp14:pctHeight>
+            </wp14:sizeRelV>
+          </wp:anchor>
+        </w:drawing>
+      </w:r>
+      <w:r>
+        <w:rPr>
+          <w:rFonts w:ascii="Angsana New" w:hAnsi="Angsana New" w:hint="cs"/>
+          <w:noProof/>
+          <w:sz w:val="32"/>
+          <w:szCs w:val="32"/>
+          <w:lang w:val="en-US"/>
+        </w:rPr>
+        <mc:AlternateContent>
+          <mc:Choice Requires="wps">
+            <w:drawing>
+              <wp:anchor distT="0" distB="0" distL="114300" distR="114300" simplePos="0" relativeHeight="251699200" behindDoc="0" locked="0" layoutInCell="1" allowOverlap="1" wp14:anchorId="3438F59D" wp14:editId="0782286C">
+                <wp:simplePos x="0" y="0"/>
+                <wp:positionH relativeFrom="column">
+                  <wp:posOffset>4670425</wp:posOffset>
+                </wp:positionH>
+                <wp:positionV relativeFrom="page">
+                  <wp:posOffset>5000625</wp:posOffset>
+                </wp:positionV>
+                <wp:extent cx="2106295" cy="602615"/>
+                <wp:effectExtent l="0" t="0" r="1905" b="0"/>
+                <wp:wrapNone/>
+                <wp:docPr id="418864775" name="Text Box 1"/>
+                <wp:cNvGraphicFramePr/>
+                <a:graphic xmlns:a="http://schemas.openxmlformats.org/drawingml/2006/main">
+                  <a:graphicData uri="http://schemas.microsoft.com/office/word/2010/wordprocessingShape">
+                    <wps:wsp>
+                      <wps:cNvSpPr txBox="1"/>
+                      <wps:spPr>
+                        <a:xfrm>
+                          <a:off x="0" y="0"/>
+                          <a:ext cx="2106295" cy="602615"/>
+                        </a:xfrm>
+                        <a:prstGeom prst="rect">
+                          <a:avLst/>
+                        </a:prstGeom>
+                        <a:solidFill>
+                          <a:schemeClr val="lt1"/>
+                        </a:solidFill>
+                        <a:ln w="6350">
+                          <a:noFill/>
+                        </a:ln>
+                      </wps:spPr>
+                      <wps:txbx>
+                        <w:txbxContent>
+                          <w:p>
+                            <w:pPr>
+                              <w:spacing w:after="0" w:line="240" w:lineRule="auto"/>
+                              <w:jc w:val="center"/>
+                            </w:pPr>
+                            <w:r>
+                              <w:rPr>
+                                <w:cs/>
+                              </w:rPr>
+                              <w:t>ผลการทำนาย: เลข 5</w:t>
+                            </w:r>
+                          </w:p>
+                          <w:p>
+                            <w:pPr>
+                              <w:spacing w:after="0" w:line="240" w:lineRule="auto"/>
+                              <w:jc w:val="center"/>
+                              <w:rPr>
+                                <w:sz w:val="28"/>
+                                <w:szCs w:val="28"/>
+                              </w:rPr>
+                            </w:pPr>
+                            <w:r>
+                              <w:rPr>
+                                <w:cs/>
+                              </w:rPr>
+                              <w:t>ความมั่นใจ: 99.78%</w:t>
+                            </w:r>
+                          </w:p>
+                        </w:txbxContent>
+                      </wps:txbx>
+                      <wps:bodyPr rot="0" spcFirstLastPara="0" vertOverflow="overflow" horzOverflow="overflow" vert="horz" wrap="square" lIns="91440" tIns="45720" rIns="91440" bIns="45720" numCol="1" spcCol="0" rtlCol="0" fromWordArt="0" anchor="t" anchorCtr="0" forceAA="0" compatLnSpc="1">
+                        <a:prstTxWarp prst="textNoShape">
+                          <a:avLst/>
+                        </a:prstTxWarp>
+                        <a:noAutofit/>
+                      </wps:bodyPr>
+                    </wps:wsp>
+                  </a:graphicData>
+                </a:graphic>
+                <wp14:sizeRelV relativeFrom="margin">
+                  <wp14:pctHeight>0</wp14:pctHeight>
+                </wp14:sizeRelV>
+              </wp:anchor>
+            </w:drawing>
+          </mc:Choice>
+          <mc:Fallback>
+            <w:pict>
+              <v:shape w14:anchorId="3438F59D" id="_x0000_s1031" type="#_x0000_t202" style="position:absolute;margin-left:367.75pt;margin-top:393.75pt;width:165.85pt;height:47.45pt;z-index:251699200;visibility:visible;mso-wrap-style:square;mso-height-percent:0;mso-wrap-distance-left:9pt;mso-wrap-distance-top:0;mso-wrap-distance-right:9pt;mso-wrap-distance-bottom:0;mso-position-horizontal:absolute;mso-position-horizontal-relative:text;mso-position-vertical:absolute;mso-position-vertical-relative:page;mso-height-percent:0;mso-height-relative:margin;v-text-anchor:top" o:gfxdata="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" fillcolor="white [3201]" stroked="f" strokeweight=".5pt">
+                <v:textbox>
+                  <w:txbxContent>
+                    <w:p>
+                      <w:pPr>
+                        <w:spacing w:after="0" w:line="240" w:lineRule="auto"/>
+                        <w:jc w:val="center"/>
+                      </w:pPr>
+                      <w:r>
+                        <w:rPr>
+                          <w:cs/>
+                        </w:rPr>
+                        <w:t>ผลการทำนาย: เลข 5</w:t>
+                      </w:r>
+                    </w:p>
+                    <w:p>
+                      <w:pPr>
+                        <w:spacing w:after="0" w:line="240" w:lineRule="auto"/>
+                        <w:jc w:val="center"/>
+                        <w:rPr>
+                          <w:sz w:val="28"/>
+                          <w:szCs w:val="28"/>
+                        </w:rPr>
+                      </w:pPr>
+                      <w:r>
+                        <w:rPr>
+                          <w:cs/>
+                        </w:rPr>
+                        <w:t>ความมั่นใจ: 99.78%</w:t>
+                      </w:r>
+                    </w:p>
+                  </w:txbxContent>
+                </v:textbox>
+                <w10:wrap anchory="page"/>
+              </v:shape>
+            </w:pict>
+          </mc:Fallback>
+        </mc:AlternateContent>
+      </w:r>
+      <w:r>
+        <w:rPr>
+          <w:rFonts w:ascii="Angsana New" w:hAnsi="Angsana New"/>
+          <w:sz w:val="32"/>
+          <w:szCs w:val="32"/>
+          <w:cs/>
+          <w:lang w:val="en-US"/>
+        </w:rPr>
+        <w:drawing>
+          <wp:anchor distT="0" distB="0" distL="114300" distR="114300" simplePos="0" relativeHeight="251701248" behindDoc="0" locked="0" layoutInCell="1" allowOverlap="1" wp14:anchorId="2A70F903" wp14:editId="63246D4E">
+            <wp:simplePos x="0" y="0"/>
+            <wp:positionH relativeFrom="column">
+              <wp:posOffset>4445</wp:posOffset>
+            </wp:positionH>
+            <wp:positionV relativeFrom="page">
+              <wp:posOffset>5977255</wp:posOffset>
+            </wp:positionV>
+            <wp:extent cx="1611630" cy="1611630"/>
+            <wp:effectExtent l="0" t="0" r="1270" b="1270"/>
+            <wp:wrapNone/>
+            <wp:docPr id="2091441376" name="Picture 1" descr="A silver and black pixelated object&#10;&#10;AI-generated content may be incorrect."/>
+            <wp:cNvGraphicFramePr>
+              <a:graphicFrameLocks xmlns:a="http://schemas.openxmlformats.org/drawingml/2006/main" noChangeAspect="1"/>
+            </wp:cNvGraphicFramePr>
+            <a:graphic xmlns:a="http://schemas.openxmlformats.org/drawingml/2006/main">
+              <a:graphicData uri="http://schemas.openxmlformats.org/drawingml/2006/picture">
+                <pic:pic xmlns:pic="http://schemas.openxmlformats.org/drawingml/2006/picture">
+                  <pic:nvPicPr>
+                    <pic:cNvPr id="2091441376" name="Picture 1" descr="A silver and black pixelated object&#10;&#10;AI-generated content may be incorrect."/>
+                    <pic:cNvPicPr/>
+                  </pic:nvPicPr>
+                  <pic:blipFill>
+                    <a:blip r:embed="rId16"/>
+                    <a:stretch>
+                      <a:fillRect/>
+                    </a:stretch>
+                  </pic:blipFill>
+                  <pic:spPr>
+                    <a:xfrm>
+                      <a:off x="0" y="0"/>
+                      <a:ext cx="1611630" cy="1611630"/>
+                    </a:xfrm>
+                    <a:prstGeom prst="rect">
+                      <a:avLst/>
+                    </a:prstGeom>
+                  </pic:spPr>
+                </pic:pic>
+              </a:graphicData>
+            </a:graphic>
+            <wp14:sizeRelH relativeFrom="margin">
+              <wp14:pctWidth>0</wp14:pctWidth>
+            </wp14:sizeRelH>
+            <wp14:sizeRelV relativeFrom="margin">
+              <wp14:pctHeight>0</wp14:pctHeight>
+            </wp14:sizeRelV>
+          </wp:anchor>
+        </w:drawing>
+      </w:r>
+      <w:r>
+        <w:rPr>
+          <w:rFonts w:ascii="Angsana New" w:hAnsi="Angsana New" w:hint="cs"/>
+          <w:noProof/>
+          <w:sz w:val="32"/>
+          <w:szCs w:val="32"/>
+          <w:lang w:val="en-US"/>
+        </w:rPr>
+        <mc:AlternateContent>
+          <mc:Choice Requires="wps">
+            <w:drawing>
+              <wp:anchor distT="0" distB="0" distL="114300" distR="114300" simplePos="0" relativeHeight="251705344" behindDoc="0" locked="0" layoutInCell="1" allowOverlap="1" wp14:anchorId="6A2C32FF" wp14:editId="7C9E620C">
+                <wp:simplePos x="0" y="0"/>
+                <wp:positionH relativeFrom="column">
+                  <wp:posOffset>-259715</wp:posOffset>
+                </wp:positionH>
+                <wp:positionV relativeFrom="page">
+                  <wp:posOffset>7687310</wp:posOffset>
+                </wp:positionV>
+                <wp:extent cx="2106295" cy="602615"/>
+                <wp:effectExtent l="0" t="0" r="1905" b="0"/>
+                <wp:wrapNone/>
+                <wp:docPr id="45404276" name="Text Box 1"/>
+                <wp:cNvGraphicFramePr/>
+                <a:graphic xmlns:a="http://schemas.openxmlformats.org/drawingml/2006/main">
+                  <a:graphicData uri="http://schemas.microsoft.com/office/word/2010/wordprocessingShape">
+                    <wps:wsp>
+                      <wps:cNvSpPr txBox="1"/>
+                      <wps:spPr>
+                        <a:xfrm>
+                          <a:off x="0" y="0"/>
+                          <a:ext cx="2106295" cy="602615"/>
+                        </a:xfrm>
+                        <a:prstGeom prst="rect">
+                          <a:avLst/>
+                        </a:prstGeom>
+                        <a:solidFill>
+                          <a:schemeClr val="lt1"/>
+                        </a:solidFill>
+                        <a:ln w="6350">
+                          <a:noFill/>
+                        </a:ln>
+                      </wps:spPr>
+                      <wps:txbx>
+                        <w:txbxContent>
+                          <w:p>
+                            <w:pPr>
+                              <w:spacing w:after="0" w:line="240" w:lineRule="auto"/>
+                              <w:jc w:val="center"/>
+                              <w:rPr>
+                                <w:rFonts w:ascii="Angsana New" w:hAnsi="Angsana New" w:hint="cs"/>
+                                <w:sz w:val="28"/>
+                                <w:szCs w:val="28"/>
+                              </w:rPr>
+                            </w:pPr>
+                            <w:r>
+                              <w:rPr>
+                                <w:rFonts w:ascii="Angsana New" w:hAnsi="Angsana New" w:hint="cs"/>
+                                <w:sz w:val="28"/>
+                                <w:szCs w:val="28"/>
+                                <w:cs/>
+                              </w:rPr>
+                              <w:t xml:space="preserve">ผลการทำนาย: เลข </w:t>
+                            </w:r>
+                            <w:r>
+                              <w:rPr>
+                                <w:rFonts w:ascii="Angsana New" w:hAnsi="Angsana New" w:hint="cs"/>
+                                <w:sz w:val="28"/>
+                                <w:szCs w:val="28"/>
+                              </w:rPr>
+                              <w:t>6</w:t>
+                            </w:r>
+                          </w:p>
+                          <w:p>
+                            <w:pPr>
+                              <w:spacing w:after="0" w:line="240" w:lineRule="auto"/>
+                              <w:jc w:val="center"/>
+                              <w:rPr>
+                                <w:rFonts w:ascii="Angsana New" w:hAnsi="Angsana New" w:hint="cs"/>
+                                <w:sz w:val="28"/>
+                                <w:szCs w:val="28"/>
+                              </w:rPr>
+                            </w:pPr>
+                            <w:r>
+                              <w:rPr>
+                                <w:rFonts w:ascii="Angsana New" w:hAnsi="Angsana New" w:hint="cs"/>
+                                <w:sz w:val="28"/>
+                                <w:szCs w:val="28"/>
+                                <w:cs/>
+                              </w:rPr>
+                              <w:t xml:space="preserve">ความมั่นใจ: </w:t>
+                            </w:r>
+                            <w:r>
+                              <w:rPr>
+                                <w:rFonts w:ascii="Angsana New" w:hAnsi="Angsana New"/>
+                                <w:sz w:val="28"/>
+                                <w:szCs w:val="28"/>
+                              </w:rPr>
+                              <w:t>99.99</w:t>
+                            </w:r>
+                            <w:r>
+                              <w:rPr>
+                                <w:rFonts w:ascii="Angsana New" w:hAnsi="Angsana New" w:hint="cs"/>
+                                <w:sz w:val="28"/>
+                                <w:szCs w:val="28"/>
+                                <w:cs/>
+                              </w:rPr>
+                              <w:t>%</w:t>
+                            </w:r>
+                          </w:p>
+                        </w:txbxContent>
+                      </wps:txbx>
+                      <wps:bodyPr rot="0" spcFirstLastPara="0" vertOverflow="overflow" horzOverflow="overflow" vert="horz" wrap="square" lIns="91440" tIns="45720" rIns="91440" bIns="45720" numCol="1" spcCol="0" rtlCol="0" fromWordArt="0" anchor="t" anchorCtr="0" forceAA="0" compatLnSpc="1">
+                        <a:prstTxWarp prst="textNoShape">
+                          <a:avLst/>
+                        </a:prstTxWarp>
+                        <a:noAutofit/>
+                      </wps:bodyPr>
+                    </wps:wsp>
+                  </a:graphicData>
+                </a:graphic>
+                <wp14:sizeRelV relativeFrom="margin">
+                  <wp14:pctHeight>0</wp14:pctHeight>
+                </wp14:sizeRelV>
+              </wp:anchor>
+            </w:drawing>
+          </mc:Choice>
+          <mc:Fallback>
+            <w:pict>
+              <v:shape w14:anchorId="6A2C32FF" id="_x0000_s1032" type="#_x0000_t202" style="position:absolute;margin-left:-20.45pt;margin-top:605.3pt;width:165.85pt;height:47.45pt;z-index:251705344;visibility:visible;mso-wrap-style:square;mso-height-percent:0;mso-wrap-distance-left:9pt;mso-wrap-distance-top:0;mso-wrap-distance-right:9pt;mso-wrap-distance-bottom:0;mso-position-horizontal:absolute;mso-position-horizontal-relative:text;mso-position-vertical:absolute;mso-position-vertical-relative:page;mso-height-percent:0;mso-height-relative:margin;v-text-anchor:top" o:gfxdata="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" fillcolor="white [3201]" stroked="f" strokeweight=".5pt">
+                <v:textbox>
+                  <w:txbxContent>
+                    <w:p>
+                      <w:pPr>
+                        <w:spacing w:after="0" w:line="240" w:lineRule="auto"/>
+                        <w:jc w:val="center"/>
+                        <w:rPr>
+                          <w:rFonts w:ascii="Angsana New" w:hAnsi="Angsana New" w:hint="cs"/>
+                          <w:sz w:val="28"/>
+                          <w:szCs w:val="28"/>
+                        </w:rPr>
+                      </w:pPr>
+                      <w:r>
+                        <w:rPr>
+                          <w:rFonts w:ascii="Angsana New" w:hAnsi="Angsana New" w:hint="cs"/>
+                          <w:sz w:val="28"/>
+                          <w:szCs w:val="28"/>
+                          <w:cs/>
+                        </w:rPr>
+                        <w:t xml:space="preserve">ผลการทำนาย: เลข </w:t>
+                      </w:r>
+                      <w:r>
+                        <w:rPr>
+                          <w:rFonts w:ascii="Angsana New" w:hAnsi="Angsana New" w:hint="cs"/>
+                          <w:sz w:val="28"/>
+                          <w:szCs w:val="28"/>
+                        </w:rPr>
+                        <w:t>6</w:t>
+                      </w:r>
+                    </w:p>
+                    <w:p>
+                      <w:pPr>
+                        <w:spacing w:after="0" w:line="240" w:lineRule="auto"/>
+                        <w:jc w:val="center"/>
+                        <w:rPr>
+                          <w:rFonts w:ascii="Angsana New" w:hAnsi="Angsana New" w:hint="cs"/>
+                          <w:sz w:val="28"/>
+                          <w:szCs w:val="28"/>
+                        </w:rPr>
+                      </w:pPr>
+                      <w:r>
+                        <w:rPr>
+                          <w:rFonts w:ascii="Angsana New" w:hAnsi="Angsana New" w:hint="cs"/>
+                          <w:sz w:val="28"/>
+                          <w:szCs w:val="28"/>
+                          <w:cs/>
+                        </w:rPr>
+                        <w:t xml:space="preserve">ความมั่นใจ: </w:t>
+                      </w:r>
+                      <w:r>
+                        <w:rPr>
+                          <w:rFonts w:ascii="Angsana New" w:hAnsi="Angsana New"/>
+                          <w:sz w:val="28"/>
+                          <w:szCs w:val="28"/>
+                        </w:rPr>
+                        <w:t>99.99</w:t>
+                      </w:r>
+                      <w:r>
+                        <w:rPr>
+                          <w:rFonts w:ascii="Angsana New" w:hAnsi="Angsana New" w:hint="cs"/>
+                          <w:sz w:val="28"/>
+                          <w:szCs w:val="28"/>
+                          <w:cs/>
+                        </w:rPr>
+                        <w:t>%</w:t>
+                      </w:r>
+                    </w:p>
+                  </w:txbxContent>
+                </v:textbox>
+                <w10:wrap anchory="page"/>
+              </v:shape>
+            </w:pict>
+          </mc:Fallback>
+        </mc:AlternateContent>
+      </w:r>
+      <w:r>
+        <w:rPr>
+          <w:rFonts w:ascii="Angsana New" w:hAnsi="Angsana New"/>
+          <w:sz w:val="32"/>
+          <w:szCs w:val="32"/>
+          <w:lang w:val="en-US"/>
+        </w:rPr>
+        <w:drawing>
+          <wp:anchor distT="0" distB="0" distL="114300" distR="114300" simplePos="0" relativeHeight="251707392" behindDoc="0" locked="0" layoutInCell="1" allowOverlap="1" wp14:anchorId="6A510809" wp14:editId="6EC45283">
+            <wp:simplePos x="0" y="0"/>
+            <wp:positionH relativeFrom="column">
+              <wp:posOffset>2448560</wp:posOffset>
+            </wp:positionH>
+            <wp:positionV relativeFrom="page">
+              <wp:posOffset>5923280</wp:posOffset>
+            </wp:positionV>
+            <wp:extent cx="1665605" cy="1665605"/>
+            <wp:effectExtent l="0" t="0" r="0" b="0"/>
+            <wp:wrapNone/>
+            <wp:docPr id="1228281553" name="Picture 1" descr="A number on a black background&#10;&#10;AI-generated content may be incorrect."/>
+            <wp:cNvGraphicFramePr>
+              <a:graphicFrameLocks xmlns:a="http://schemas.openxmlformats.org/drawingml/2006/main" noChangeAspect="1"/>
+            </wp:cNvGraphicFramePr>
+            <a:graphic xmlns:a="http://schemas.openxmlformats.org/drawingml/2006/main">
+              <a:graphicData uri="http://schemas.openxmlformats.org/drawingml/2006/picture">
+                <pic:pic xmlns:pic="http://schemas.openxmlformats.org/drawingml/2006/picture">
+                  <pic:nvPicPr>
+                    <pic:cNvPr id="1228281553" name="Picture 1" descr="A number on a black background&#10;&#10;AI-generated content may be incorrect."/>
+                    <pic:cNvPicPr/>
+                  </pic:nvPicPr>
+                  <pic:blipFill>
+                    <a:blip r:embed="rId17"/>
+                    <a:stretch>
+                      <a:fillRect/>
+                    </a:stretch>
+                  </pic:blipFill>
+                  <pic:spPr>
+                    <a:xfrm>
+                      <a:off x="0" y="0"/>
+                      <a:ext cx="1665605" cy="1665605"/>
+                    </a:xfrm>
+                    <a:prstGeom prst="rect">
+                      <a:avLst/>
+                    </a:prstGeom>
+                  </pic:spPr>
+                </pic:pic>
+              </a:graphicData>
+            </a:graphic>
+            <wp14:sizeRelH relativeFrom="margin">
+              <wp14:pctWidth>0</wp14:pctWidth>
+            </wp14:sizeRelH>
+            <wp14:sizeRelV relativeFrom="margin">
+              <wp14:pctHeight>0</wp14:pctHeight>
+            </wp14:sizeRelV>
+          </wp:anchor>
+        </w:drawing>
+      </w:r>
+      <w:r>
+        <w:rPr>
+          <w:rFonts w:ascii="Angsana New" w:hAnsi="Angsana New" w:hint="cs"/>
+          <w:noProof/>
+          <w:sz w:val="32"/>
+          <w:szCs w:val="32"/>
+          <w:lang w:val="en-US"/>
+        </w:rPr>
+        <mc:AlternateContent>
+          <mc:Choice Requires="wps">
+            <w:drawing>
+              <wp:anchor distT="0" distB="0" distL="114300" distR="114300" simplePos="0" relativeHeight="251709440" behindDoc="0" locked="0" layoutInCell="1" allowOverlap="1" wp14:anchorId="71A0FA48" wp14:editId="466012F6">
+                <wp:simplePos x="0" y="0"/>
+                <wp:positionH relativeFrom="column">
+                  <wp:posOffset>2230120</wp:posOffset>
+                </wp:positionH>
+                <wp:positionV relativeFrom="page">
+                  <wp:posOffset>7687310</wp:posOffset>
+                </wp:positionV>
+                <wp:extent cx="2106295" cy="602615"/>
+                <wp:effectExtent l="0" t="0" r="1905" b="0"/>
+                <wp:wrapNone/>
+                <wp:docPr id="1345003663" name="Text Box 1"/>
+                <wp:cNvGraphicFramePr/>
+                <a:graphic xmlns:a="http://schemas.openxmlformats.org/drawingml/2006/main">
+                  <a:graphicData uri="http://schemas.microsoft.com/office/word/2010/wordprocessingShape">
+                    <wps:wsp>
+                      <wps:cNvSpPr txBox="1"/>
+                      <wps:spPr>
+                        <a:xfrm>
+                          <a:off x="0" y="0"/>
+                          <a:ext cx="2106295" cy="602615"/>
+                        </a:xfrm>
+                        <a:prstGeom prst="rect">
+                          <a:avLst/>
+                        </a:prstGeom>
+                        <a:solidFill>
+                          <a:schemeClr val="lt1"/>
+                        </a:solidFill>
+                        <a:ln w="6350">
+                          <a:noFill/>
+                        </a:ln>
+                      </wps:spPr>
+                      <wps:txbx>
+                        <w:txbxContent>
+                          <w:p>
+                            <w:pPr>
+                              <w:spacing w:after="0" w:line="240" w:lineRule="auto"/>
+                              <w:jc w:val="center"/>
+                              <w:rPr>
+                                <w:rFonts w:ascii="Angsana New" w:hAnsi="Angsana New"/>
+                                <w:sz w:val="28"/>
+                                <w:szCs w:val="28"/>
+                              </w:rPr>
+                            </w:pPr>
+                            <w:r>
+                              <w:rPr>
+                                <w:rFonts w:ascii="Angsana New" w:hAnsi="Angsana New"/>
+                                <w:sz w:val="28"/>
+                                <w:szCs w:val="28"/>
+                                <w:cs/>
+                              </w:rPr>
+                              <w:t>ผลการทำนาย: เลข 7</w:t>
+                            </w:r>
+                          </w:p>
+                          <w:p>
+                            <w:pPr>
+                              <w:spacing w:after="0" w:line="240" w:lineRule="auto"/>
+                              <w:jc w:val="center"/>
+                              <w:rPr>
+                                <w:rFonts w:ascii="Angsana New" w:hAnsi="Angsana New" w:hint="cs"/>
+                                <w:sz w:val="28"/>
+                                <w:szCs w:val="28"/>
+                              </w:rPr>
+                            </w:pPr>
+                            <w:r>
+                              <w:rPr>
+                                <w:rFonts w:ascii="Angsana New" w:hAnsi="Angsana New"/>
+                                <w:sz w:val="28"/>
+                                <w:szCs w:val="28"/>
+                                <w:cs/>
+                              </w:rPr>
+                              <w:t>ความมั่นใจ: 75.48%</w:t>
+                            </w:r>
+                          </w:p>
+                        </w:txbxContent>
+                      </wps:txbx>
+                      <wps:bodyPr rot="0" spcFirstLastPara="0" vertOverflow="overflow" horzOverflow="overflow" vert="horz" wrap="square" lIns="91440" tIns="45720" rIns="91440" bIns="45720" numCol="1" spcCol="0" rtlCol="0" fromWordArt="0" anchor="t" anchorCtr="0" forceAA="0" compatLnSpc="1">
+                        <a:prstTxWarp prst="textNoShape">
+                          <a:avLst/>
+                        </a:prstTxWarp>
+                        <a:noAutofit/>
+                      </wps:bodyPr>
+                    </wps:wsp>
+                  </a:graphicData>
+                </a:graphic>
+                <wp14:sizeRelV relativeFrom="margin">
+                  <wp14:pctHeight>0</wp14:pctHeight>
+                </wp14:sizeRelV>
+              </wp:anchor>
+            </w:drawing>
+          </mc:Choice>
+          <mc:Fallback>
+            <w:pict>
+              <v:shape w14:anchorId="71A0FA48" id="_x0000_s1033" type="#_x0000_t202" style="position:absolute;margin-left:175.6pt;margin-top:605.3pt;width:165.85pt;height:47.45pt;z-index:251709440;visibility:visible;mso-wrap-style:square;mso-height-percent:0;mso-wrap-distance-left:9pt;mso-wrap-distance-top:0;mso-wrap-distance-right:9pt;mso-wrap-distance-bottom:0;mso-position-horizontal:absolute;mso-position-horizontal-relative:text;mso-position-vertical:absolute;mso-position-vertical-relative:page;mso-height-percent:0;mso-height-relative:margin;v-text-anchor:top" o:gfxdata="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" fillcolor="white [3201]" stroked="f" strokeweight=".5pt">
+                <v:textbox>
+                  <w:txbxContent>
+                    <w:p>
+                      <w:pPr>
+                        <w:spacing w:after="0" w:line="240" w:lineRule="auto"/>
+                        <w:jc w:val="center"/>
+                        <w:rPr>
+                          <w:rFonts w:ascii="Angsana New" w:hAnsi="Angsana New"/>
+                          <w:sz w:val="28"/>
+                          <w:szCs w:val="28"/>
+                        </w:rPr>
+                      </w:pPr>
+                      <w:r>
+                        <w:rPr>
+                          <w:rFonts w:ascii="Angsana New" w:hAnsi="Angsana New"/>
+                          <w:sz w:val="28"/>
+                          <w:szCs w:val="28"/>
+                          <w:cs/>
+                        </w:rPr>
+                        <w:t>ผลการทำนาย: เลข 7</w:t>
+                      </w:r>
+                    </w:p>
+                    <w:p>
+                      <w:pPr>
+                        <w:spacing w:after="0" w:line="240" w:lineRule="auto"/>
+                        <w:jc w:val="center"/>
+                        <w:rPr>
+                          <w:rFonts w:ascii="Angsana New" w:hAnsi="Angsana New" w:hint="cs"/>
+                          <w:sz w:val="28"/>
+                          <w:szCs w:val="28"/>
+                        </w:rPr>
+                      </w:pPr>
+                      <w:r>
+                        <w:rPr>
+                          <w:rFonts w:ascii="Angsana New" w:hAnsi="Angsana New"/>
+                          <w:sz w:val="28"/>
+                          <w:szCs w:val="28"/>
+                          <w:cs/>
+                        </w:rPr>
+                        <w:t>ความมั่นใจ: 75.48%</w:t>
+                      </w:r>
+                    </w:p>
+                  </w:txbxContent>
+                </v:textbox>
+                <w10:wrap anchory="page"/>
+              </v:shape>
+            </w:pict>
+          </mc:Fallback>
+        </mc:AlternateContent>
+      </w:r>
+      <w:r>
+        <w:rPr>
+          <w:rFonts w:ascii="Angsana New" w:hAnsi="Angsana New"/>
+          <w:sz w:val="32"/>
+          <w:szCs w:val="32"/>
+          <w:lang w:val="en-US"/>
+        </w:rPr>
+        <w:drawing>
+          <wp:anchor distT="0" distB="0" distL="114300" distR="114300" simplePos="0" relativeHeight="251711488" behindDoc="0" locked="0" layoutInCell="1" allowOverlap="1" wp14:anchorId="19E3513D" wp14:editId="43E86B10">
+            <wp:simplePos x="0" y="0"/>
+            <wp:positionH relativeFrom="column">
+              <wp:posOffset>4937760</wp:posOffset>
+            </wp:positionH>
+            <wp:positionV relativeFrom="page">
+              <wp:posOffset>5923280</wp:posOffset>
+            </wp:positionV>
+            <wp:extent cx="1611630" cy="1611630"/>
+            <wp:effectExtent l="0" t="0" r="1270" b="1270"/>
+            <wp:wrapNone/>
+            <wp:docPr id="1170085457" name="Picture 1" descr="A number on a black background&#10;&#10;AI-generated content may be incorrect."/>
+            <wp:cNvGraphicFramePr>
+              <a:graphicFrameLocks xmlns:a="http://schemas.openxmlformats.org/drawingml/2006/main" noChangeAspect="1"/>
+            </wp:cNvGraphicFramePr>
+            <a:graphic xmlns:a="http://schemas.openxmlformats.org/drawingml/2006/main">
+              <a:graphicData uri="http://schemas.openxmlformats.org/drawingml/2006/picture">
+                <pic:pic xmlns:pic="http://schemas.openxmlformats.org/drawingml/2006/picture">
+                  <pic:nvPicPr>
+                    <pic:cNvPr id="1170085457" name="Picture 1" descr="A number on a black background&#10;&#10;AI-generated content may be incorrect."/>
+                    <pic:cNvPicPr/>
+                  </pic:nvPicPr>
+                  <pic:blipFill>
+                    <a:blip r:embed="rId18"/>
+                    <a:stretch>
+                      <a:fillRect/>
+                    </a:stretch>
+                  </pic:blipFill>
+                  <pic:spPr>
+                    <a:xfrm>
+                      <a:off x="0" y="0"/>
+                      <a:ext cx="1611630" cy="1611630"/>
+                    </a:xfrm>
+                    <a:prstGeom prst="rect">
+                      <a:avLst/>
+                    </a:prstGeom>
+                  </pic:spPr>
+                </pic:pic>
+              </a:graphicData>
+            </a:graphic>
+            <wp14:sizeRelH relativeFrom="margin">
+              <wp14:pctWidth>0</wp14:pctWidth>
+            </wp14:sizeRelH>
+            <wp14:sizeRelV relativeFrom="margin">
+              <wp14:pctHeight>0</wp14:pctHeight>
+            </wp14:sizeRelV>
+          </wp:anchor>
+        </w:drawing>
+      </w:r>
+      <w:r>
+        <w:rPr>
+          <w:rFonts w:ascii="Angsana New" w:hAnsi="Angsana New" w:hint="cs"/>
+          <w:noProof/>
+          <w:sz w:val="32"/>
+          <w:szCs w:val="32"/>
+          <w:lang w:val="en-US"/>
+        </w:rPr>
+        <mc:AlternateContent>
+          <mc:Choice Requires="wps">
+            <w:drawing>
+              <wp:anchor distT="0" distB="0" distL="114300" distR="114300" simplePos="0" relativeHeight="251713536" behindDoc="0" locked="0" layoutInCell="1" allowOverlap="1" wp14:anchorId="5236E0B4" wp14:editId="4FE5F4AD">
+                <wp:simplePos x="0" y="0"/>
+                <wp:positionH relativeFrom="column">
+                  <wp:posOffset>4719320</wp:posOffset>
+                </wp:positionH>
+                <wp:positionV relativeFrom="page">
+                  <wp:posOffset>7687310</wp:posOffset>
+                </wp:positionV>
+                <wp:extent cx="2106295" cy="602615"/>
+                <wp:effectExtent l="0" t="0" r="1905" b="0"/>
+                <wp:wrapNone/>
+                <wp:docPr id="1778367402" name="Text Box 1"/>
+                <wp:cNvGraphicFramePr/>
+                <a:graphic xmlns:a="http://schemas.openxmlformats.org/drawingml/2006/main">
+                  <a:graphicData uri="http://schemas.microsoft.com/office/word/2010/wordprocessingShape">
+                    <wps:wsp>
+                      <wps:cNvSpPr txBox="1"/>
+                      <wps:spPr>
+                        <a:xfrm>
+                          <a:off x="0" y="0"/>
+                          <a:ext cx="2106295" cy="602615"/>
+                        </a:xfrm>
+                        <a:prstGeom prst="rect">
+                          <a:avLst/>
+                        </a:prstGeom>
+                        <a:solidFill>
+                          <a:schemeClr val="lt1"/>
+                        </a:solidFill>
+                        <a:ln w="6350">
+                          <a:noFill/>
+                        </a:ln>
+                      </wps:spPr>
+                      <wps:txbx>
+                        <w:txbxContent>
+                          <w:p>
+                            <w:pPr>
+                              <w:spacing w:after="0" w:line="240" w:lineRule="auto"/>
+                              <w:jc w:val="center"/>
+                              <w:rPr>
+                                <w:rFonts w:ascii="Angsana New" w:hAnsi="Angsana New"/>
+                                <w:sz w:val="28"/>
+                                <w:szCs w:val="28"/>
+                              </w:rPr>
+                            </w:pPr>
+                            <w:r>
+                              <w:rPr>
+                                <w:rFonts w:ascii="Angsana New" w:hAnsi="Angsana New"/>
+                                <w:sz w:val="28"/>
+                                <w:szCs w:val="28"/>
+                                <w:cs/>
+                              </w:rPr>
+                              <w:t>ผลการทำนาย: เลข 7</w:t>
+                            </w:r>
+                          </w:p>
+                          <w:p>
+                            <w:pPr>
+                              <w:spacing w:after="0" w:line="240" w:lineRule="auto"/>
+                              <w:jc w:val="center"/>
+                              <w:rPr>
+                                <w:rFonts w:ascii="Angsana New" w:hAnsi="Angsana New" w:hint="cs"/>
+                                <w:sz w:val="28"/>
+                                <w:szCs w:val="28"/>
+                              </w:rPr>
+                            </w:pPr>
+                            <w:r>
+                              <w:rPr>
+                                <w:rFonts w:ascii="Angsana New" w:hAnsi="Angsana New"/>
+                                <w:sz w:val="28"/>
+                                <w:szCs w:val="28"/>
+                                <w:cs/>
+                              </w:rPr>
+                              <w:t>ความมั่นใจ: 75.48%</w:t>
+                            </w:r>
+                          </w:p>
+                        </w:txbxContent>
+                      </wps:txbx>
+                      <wps:bodyPr rot="0" spcFirstLastPara="0" vertOverflow="overflow" horzOverflow="overflow" vert="horz" wrap="square" lIns="91440" tIns="45720" rIns="91440" bIns="45720" numCol="1" spcCol="0" rtlCol="0" fromWordArt="0" anchor="t" anchorCtr="0" forceAA="0" compatLnSpc="1">
+                        <a:prstTxWarp prst="textNoShape">
+                          <a:avLst/>
+                        </a:prstTxWarp>
+                        <a:noAutofit/>
+                      </wps:bodyPr>
+                    </wps:wsp>
+                  </a:graphicData>
+                </a:graphic>
+                <wp14:sizeRelV relativeFrom="margin">
+                  <wp14:pctHeight>0</wp14:pctHeight>
+                </wp14:sizeRelV>
+              </wp:anchor>
+            </w:drawing>
+          </mc:Choice>
+          <mc:Fallback>
+            <w:pict>
+              <v:shape w14:anchorId="5236E0B4" id="_x0000_s1034" type="#_x0000_t202" style="position:absolute;margin-left:371.6pt;margin-top:605.3pt;width:165.85pt;height:47.45pt;z-index:251713536;visibility:visible;mso-wrap-style:square;mso-height-percent:0;mso-wrap-distance-left:9pt;mso-wrap-distance-top:0;mso-wrap-distance-right:9pt;mso-wrap-distance-bottom:0;mso-position-horizontal:absolute;mso-position-horizontal-relative:text;mso-position-vertical:absolute;mso-position-vertical-relative:page;mso-height-percent:0;mso-height-relative:margin;v-text-anchor:top" o:gfxdata="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" fillcolor="white [3201]" stroked="f" strokeweight=".5pt">
+                <v:textbox>
+                  <w:txbxContent>
+                    <w:p>
+                      <w:pPr>
+                        <w:spacing w:after="0" w:line="240" w:lineRule="auto"/>
+                        <w:jc w:val="center"/>
+                        <w:rPr>
+                          <w:rFonts w:ascii="Angsana New" w:hAnsi="Angsana New"/>
+                          <w:sz w:val="28"/>
+                          <w:szCs w:val="28"/>
+                        </w:rPr>
+                      </w:pPr>
+                      <w:r>
+                        <w:rPr>
+                          <w:rFonts w:ascii="Angsana New" w:hAnsi="Angsana New"/>
+                          <w:sz w:val="28"/>
+                          <w:szCs w:val="28"/>
+                          <w:cs/>
+                        </w:rPr>
+                        <w:t>ผลการทำนาย: เลข 7</w:t>
+                      </w:r>
+                    </w:p>
+                    <w:p>
+                      <w:pPr>
+                        <w:spacing w:after="0" w:line="240" w:lineRule="auto"/>
+                        <w:jc w:val="center"/>
+                        <w:rPr>
+                          <w:rFonts w:ascii="Angsana New" w:hAnsi="Angsana New" w:hint="cs"/>
+                          <w:sz w:val="28"/>
+                          <w:szCs w:val="28"/>
+                        </w:rPr>
+                      </w:pPr>
+                      <w:r>
+                        <w:rPr>
+                          <w:rFonts w:ascii="Angsana New" w:hAnsi="Angsana New"/>
+                          <w:sz w:val="28"/>
+                          <w:szCs w:val="28"/>
+                          <w:cs/>
+                        </w:rPr>
+                        <w:t>ความมั่นใจ: 75.48%</w:t>
+                      </w:r>
+                    </w:p>
+                  </w:txbxContent>
+                </v:textbox>
+                <w10:wrap anchory="page"/>
+              </v:shape>
+            </w:pict>
+          </mc:Fallback>
+        </mc:AlternateContent>
+      </w:r>
+      <w:r>
+        <w:rPr>
+          <w:rFonts w:ascii="Angsana New" w:hAnsi="Angsana New"/>
+          <w:sz w:val="32"/>
+          <w:szCs w:val="32"/>
+          <w:lang w:val="en-US"/>
+        </w:rPr>
+        <w:drawing>
+          <wp:anchor distT="0" distB="0" distL="114300" distR="114300" simplePos="0" relativeHeight="251715584" behindDoc="0" locked="0" layoutInCell="1" allowOverlap="1" wp14:anchorId="71A8D2A3" wp14:editId="20B4B73A">
+            <wp:simplePos x="0" y="0"/>
+            <wp:positionH relativeFrom="column">
+              <wp:posOffset>2457450</wp:posOffset>
+            </wp:positionH>
+            <wp:positionV relativeFrom="page">
+              <wp:posOffset>8291195</wp:posOffset>
+            </wp:positionV>
+            <wp:extent cx="1611630" cy="1611630"/>
+            <wp:effectExtent l="0" t="0" r="1270" b="1270"/>
+            <wp:wrapNone/>
+            <wp:docPr id="502683103" name="Picture 1" descr="A pixelated image of a number&#10;&#10;AI-generated content may be incorrect."/>
+            <wp:cNvGraphicFramePr>
+              <a:graphicFrameLocks xmlns:a="http://schemas.openxmlformats.org/drawingml/2006/main" noChangeAspect="1"/>
+            </wp:cNvGraphicFramePr>
+            <a:graphic xmlns:a="http://schemas.openxmlformats.org/drawingml/2006/main">
+              <a:graphicData uri="http://schemas.openxmlformats.org/drawingml/2006/picture">
+                <pic:pic xmlns:pic="http://schemas.openxmlformats.org/drawingml/2006/picture">
+                  <pic:nvPicPr>
+                    <pic:cNvPr id="502683103" name="Picture 1" descr="A pixelated image of a number&#10;&#10;AI-generated content may be incorrect."/>
+                    <pic:cNvPicPr/>
+                  </pic:nvPicPr>
+                  <pic:blipFill>
+                    <a:blip r:embed="rId19"/>
+                    <a:stretch>
+                      <a:fillRect/>
+                    </a:stretch>
+                  </pic:blipFill>
+                  <pic:spPr>
+                    <a:xfrm>
+                      <a:off x="0" y="0"/>
+                      <a:ext cx="1611630" cy="1611630"/>
+                    </a:xfrm>
+                    <a:prstGeom prst="rect">
+                      <a:avLst/>
+                    </a:prstGeom>
+                  </pic:spPr>
+                </pic:pic>
+              </a:graphicData>
+            </a:graphic>
+            <wp14:sizeRelH relativeFrom="margin">
+              <wp14:pctWidth>0</wp14:pctWidth>
+            </wp14:sizeRelH>
+            <wp14:sizeRelV relativeFrom="margin">
+              <wp14:pctHeight>0</wp14:pctHeight>
+            </wp14:sizeRelV>
+          </wp:anchor>
+        </w:drawing>
+      </w:r>
+      <w:r>
+        <w:rPr>
+          <w:rFonts w:ascii="Angsana New" w:hAnsi="Angsana New" w:hint="cs"/>
+          <w:noProof/>
+          <w:sz w:val="32"/>
+          <w:szCs w:val="32"/>
+          <w:lang w:val="en-US"/>
+        </w:rPr>
+        <mc:AlternateContent>
+          <mc:Choice Requires="wps">
+            <w:drawing>
+              <wp:anchor distT="0" distB="0" distL="114300" distR="114300" simplePos="0" relativeHeight="251717632" behindDoc="0" locked="0" layoutInCell="1" allowOverlap="1" wp14:anchorId="1B721517" wp14:editId="61F575CA">
+                <wp:simplePos x="0" y="0"/>
+                <wp:positionH relativeFrom="column">
+                  <wp:posOffset>2230120</wp:posOffset>
+                </wp:positionH>
+                <wp:positionV relativeFrom="page">
+                  <wp:posOffset>9905195</wp:posOffset>
+                </wp:positionV>
+                <wp:extent cx="2106295" cy="602615"/>
+                <wp:effectExtent l="0" t="0" r="1905" b="0"/>
+                <wp:wrapNone/>
+                <wp:docPr id="1199177765" name="Text Box 1"/>
+                <wp:cNvGraphicFramePr/>
+                <a:graphic xmlns:a="http://schemas.openxmlformats.org/drawingml/2006/main">
+                  <a:graphicData uri="http://schemas.microsoft.com/office/word/2010/wordprocessingShape">
+                    <wps:wsp>
+                      <wps:cNvSpPr txBox="1"/>
+                      <wps:spPr>
+                        <a:xfrm>
+                          <a:off x="0" y="0"/>
+                          <a:ext cx="2106295" cy="602615"/>
+                        </a:xfrm>
+                        <a:prstGeom prst="rect">
+                          <a:avLst/>
+                        </a:prstGeom>
+                        <a:solidFill>
+                          <a:schemeClr val="lt1"/>
+                        </a:solidFill>
+                        <a:ln w="6350">
+                          <a:noFill/>
+                        </a:ln>
+                      </wps:spPr>
+                      <wps:txbx>
+                        <w:txbxContent>
+                          <w:p>
+                            <w:pPr>
+                              <w:spacing w:after="0" w:line="240" w:lineRule="auto"/>
+                              <w:jc w:val="center"/>
+                              <w:rPr>
+                                <w:rFonts w:ascii="Angsana New" w:hAnsi="Angsana New"/>
+                                <w:sz w:val="28"/>
+                                <w:szCs w:val="28"/>
+                              </w:rPr>
+                            </w:pPr>
+                            <w:r>
+                              <w:rPr>
+                                <w:rFonts w:ascii="Angsana New" w:hAnsi="Angsana New"/>
+                                <w:sz w:val="28"/>
+                                <w:szCs w:val="28"/>
+                                <w:cs/>
+                              </w:rPr>
+                              <w:t>ผลการทำนาย: เลข 9</w:t>
+                            </w:r>
+                          </w:p>
+                          <w:p>
+                            <w:pPr>
+                              <w:spacing w:after="0" w:line="240" w:lineRule="auto"/>
+                              <w:jc w:val="center"/>
+                              <w:rPr>
+                                <w:rFonts w:ascii="Angsana New" w:hAnsi="Angsana New" w:hint="cs"/>
+                                <w:sz w:val="28"/>
+                                <w:szCs w:val="28"/>
+                              </w:rPr>
+                            </w:pPr>
+                            <w:r>
+                              <w:rPr>
+                                <w:rFonts w:ascii="Angsana New" w:hAnsi="Angsana New"/>
+                                <w:sz w:val="28"/>
+                                <w:szCs w:val="28"/>
+                                <w:cs/>
+                              </w:rPr>
+                              <w:t>ความมั่นใจ: 99.99%</w:t>
+                            </w:r>
+                          </w:p>
+                        </w:txbxContent>
+                      </wps:txbx>
+                      <wps:bodyPr rot="0" spcFirstLastPara="0" vertOverflow="overflow" horzOverflow="overflow" vert="horz" wrap="square" lIns="91440" tIns="45720" rIns="91440" bIns="45720" numCol="1" spcCol="0" rtlCol="0" fromWordArt="0" anchor="t" anchorCtr="0" forceAA="0" compatLnSpc="1">
+                        <a:prstTxWarp prst="textNoShape">
+                          <a:avLst/>
+                        </a:prstTxWarp>
+                        <a:noAutofit/>
+                      </wps:bodyPr>
+                    </wps:wsp>
+                  </a:graphicData>
+                </a:graphic>
+                <wp14:sizeRelV relativeFrom="margin">
+                  <wp14:pctHeight>0</wp14:pctHeight>
+                </wp14:sizeRelV>
+              </wp:anchor>
+            </w:drawing>
+          </mc:Choice>
+          <mc:Fallback>
+            <w:pict>
+              <v:shape w14:anchorId="1B721517" id="_x0000_s1035" type="#_x0000_t202" style="position:absolute;margin-left:175.6pt;margin-top:779.95pt;width:165.85pt;height:47.45pt;z-index:251717632;visibility:visible;mso-wrap-style:square;mso-height-percent:0;mso-wrap-distance-left:9pt;mso-wrap-distance-top:0;mso-wrap-distance-right:9pt;mso-wrap-distance-bottom:0;mso-position-horizontal:absolute;mso-position-horizontal-relative:text;mso-position-vertical:absolute;mso-position-vertical-relative:page;mso-height-percent:0;mso-height-relative:margin;v-text-anchor:top" o:gfxdata="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" fillcolor="white [3201]" stroked="f" strokeweight=".5pt">
+                <v:textbox>
+                  <w:txbxContent>
+                    <w:p>
+                      <w:pPr>
+                        <w:spacing w:after="0" w:line="240" w:lineRule="auto"/>
+                        <w:jc w:val="center"/>
+                        <w:rPr>
+                          <w:rFonts w:ascii="Angsana New" w:hAnsi="Angsana New"/>
+                          <w:sz w:val="28"/>
+                          <w:szCs w:val="28"/>
+                        </w:rPr>
+                      </w:pPr>
+                      <w:r>
+                        <w:rPr>
+                          <w:rFonts w:ascii="Angsana New" w:hAnsi="Angsana New"/>
+                          <w:sz w:val="28"/>
+                          <w:szCs w:val="28"/>
+                          <w:cs/>
+                        </w:rPr>
+                        <w:t>ผลการทำนาย: เลข 9</w:t>
+                      </w:r>
+                    </w:p>
+                    <w:p>
+                      <w:pPr>
+                        <w:spacing w:after="0" w:line="240" w:lineRule="auto"/>
+                        <w:jc w:val="center"/>
+                        <w:rPr>
+                          <w:rFonts w:ascii="Angsana New" w:hAnsi="Angsana New" w:hint="cs"/>
+                          <w:sz w:val="28"/>
+                          <w:szCs w:val="28"/>
+                        </w:rPr>
+                      </w:pPr>
+                      <w:r>
+                        <w:rPr>
+                          <w:rFonts w:ascii="Angsana New" w:hAnsi="Angsana New"/>
+                          <w:sz w:val="28"/>
+                          <w:szCs w:val="28"/>
+                          <w:cs/>
+                        </w:rPr>
+                        <w:t>ความมั่นใจ: 99.99%</w:t>
+                      </w:r>
+                    </w:p>
+                  </w:txbxContent>
+                </v:textbox>
+                <w10:wrap anchory="page"/>
+              </v:shape>
+            </w:pict>
+          </mc:Fallback>
+        </mc:AlternateContent>
       </w:r>
     </w:p>
     <w:sectPr>

</xml_diff>